<commit_message>
Add CSPL chunk pipeline and TCVN Word exports for Đo đạc.
Admin can split documents into Điều/mục chunks, review them, and mark VB active before month-pack generation; includes HDSD/workflow and end-of-session handoff.

Co-authored-by: Cursor <cursoragent@cursor.com>
</commit_message>
<xml_diff>
--- a/docs/tcvn/TCVN-9401-2024.docx
+++ b/docs/tcvn/TCVN-9401-2024.docx
@@ -144,7 +144,7 @@
           <w:sz w:val="18"/>
           <w:szCs w:val="18"/>
         </w:rPr>
-        <w:t xml:space="preserve">Bản Word biên tập lại từ OCR PDF scan, trình bày theo thể thức văn bản kỹ thuật (lề A4 kiểu TT 01/2011/TT-BNV; bảng kẻ viền). Nội dung kỹ thuật đối chiếu TCVN 9401:2024; bảng phức tạp / phụ lục số nên kiểm tra PDF gốc.</w:t>
+        <w:t xml:space="preserve">Bản Word biên tập từ OCR PDF, trình bày theo thể thức văn bản kỹ thuật (lề A4 kiểu TT 01/2011/TT-BNV; bảng kẻ viền). Nội dung kỹ thuật đối chiếu TCVN 9401:2024; bảng phức tạp / phụ lục số nên kiểm tra PDF gốc.</w:t>
       </w:r>
     </w:p>
     <w:p>
@@ -1736,7 +1736,7 @@
           <w:sz w:val="26"/>
           <w:szCs w:val="26"/>
         </w:rPr>
-        <w:t xml:space="preserve">Hiệu các trị đo pha thu được tai hai máy thu đồng thời đến từ cùng một vệ tinh.</w:t>
+        <w:t xml:space="preserve">Hiệu các trị do pha thu được tai hai máy thu đồng thời đến từ cùng một vệ tinh.</w:t>
       </w:r>
     </w:p>
     <w:p>
@@ -2021,7 +2021,7 @@
           <w:sz w:val="26"/>
           <w:szCs w:val="26"/>
         </w:rPr>
-        <w:t xml:space="preserve">Tập hợp số liệu biểu thị vị trí không gian của mặt đẳng thế gốc (Wo) so với mặt Ellipsoid tham chiếu trong hệ quy chiếu Trái đất. Mô hình Geoid được sử dụng để xác định độ cao thủy chuẩn của các điểm khi đo bằng công nghệ GNSS.</w:t>
+        <w:t xml:space="preserve">Tập hợp số liệu biểu thị vị trí không gian của mặt đẳng thé gốc (Wo) so với mặt Ellipsoid tham chiếu trong hệ quy chiếu Trái đất. Mô hình Geoid được sử dụng để xác định độ cao thủy chuẩn của các điểm khi đo bằng công nghệ GNSS.</w:t>
       </w:r>
     </w:p>
     <w:p>
@@ -2325,7 +2325,7 @@
           <w:sz w:val="26"/>
           <w:szCs w:val="26"/>
         </w:rPr>
-        <w:t xml:space="preserve">Hệ độ cao được thiết lập theo mốc thời gian xác định và sử dụng thống nhất trong cả nước để xác định giá trị độ cao của đối tượng địa lý.</w:t>
+        <w:t xml:space="preserve">Hệ độ cao được thiết lập theo mốc thời gian xác định và sử dụng thống nhất trong cả nước dé xác định giá trị độ cao của đối tượng địa lý.</w:t>
       </w:r>
     </w:p>
     <w:p>
@@ -2576,7 +2576,7 @@
           <w:sz w:val="26"/>
           <w:szCs w:val="26"/>
         </w:rPr>
-        <w:t xml:space="preserve">Từ viết tắt Ý nghĩa PDOP (Position Dilusion of Precision) Hệ số suy giảm độ chính xác vị trí vệ tinh PPK (Post Processing Kinematic) Đo động xử lý sau PPP (Precise Point Positioning) Định vị điểm chính xác Ratio Tỷ số phương sai RINEX (Receiver INdependent EXchange Chuẩn dữ liệu trị đo GNSS theo khuôn dạng dữ liệu format) ASCII được sử dụng để thuận tiện cho việc xử lý không phụ thuộc máy thu hoặc phần mềm RMS (Root Mean Square) Sai số trung phương RTK (Real-Time Kinematic) Đo động thời gian thực Single Base Dịch vụ cải chính sử dụng giải pháp công nghệ trạm đơn UTM (Universal Transverse Mercator) Lưới chiếu hình trụ ngang đồng góc VDOP (Vertical Dilution of Position) Hệ số suy giảm độ chính xác độ cao VN-2000 Tên Hệ quy chiếu và Hệ tọa độ quốc gia hiện hành của Việt Nam VRS (Virtual Reference Station) Trạm tham chiếu ảo WGS - 84 (World Geodetic System - 1984) Hệ tọa độ trắc địa thế giới - 1984 § Quy định chung</w:t>
+        <w:t xml:space="preserve">Từ viết tắt Ý nghĩa PDOP (Position Dilusion of Precision) Hệ số suy giảm độ chính xác vị trí vệ tinh PPK (Post Processing Kinematic) Do động xử lý sau PPP (Precise Point Positioning) Định vị điểm chính xác Ratio Tỷ số phương sai RINEX (Receiver INdependent EXchange Chuẩn dữ liệu trị đo GNSS theo khuôn dang dữ liệu format) ASCII được sử dụng để thuận tiện cho việc xử lý không phụ thuộc máy thu hoặc phần mềm RMS (Root Mean Square) Sai số trung phương RTK (Real-Time Kinematic) Do động thời gian thực Single Base Dịch vụ cải chính sử dụng giải pháp công nghệ trạm đơn UTM (Universal Transverse Mercator) Lưới chiếu hình trụ ngang đồng góc VDOP (Vertical Dilution of Position) Hệ số suy giảm độ chính xác độ cao VN-2000 Tên Hệ quy chiếu và Hệ tọa độ quốc gia hiện hành của Việt Nam VRS (Virtual Reference Station) Tram tham chiếu ảo WGS - 84 (World Geodetic System - 1984) Hệ tọa độ trắc địa thế giới - 1984 § Quy định chung</w:t>
       </w:r>
     </w:p>
     <w:p>
@@ -2650,7 +2650,7 @@
           <w:sz w:val="26"/>
           <w:szCs w:val="26"/>
         </w:rPr>
-        <w:t xml:space="preserve">— Lập phương án kỹ thuật và trình duyệt,</w:t>
+        <w:t xml:space="preserve">— Lap phương án kỹ thuật và trình duyệt,</w:t>
       </w:r>
     </w:p>
     <w:p>
@@ -2669,7 +2669,7 @@
           <w:sz w:val="26"/>
           <w:szCs w:val="26"/>
         </w:rPr>
-        <w:t xml:space="preserve">— Chọn điểm, xây dựng mốc;</w:t>
+        <w:t xml:space="preserve">— Chon điểm, xây dựng mốc;</w:t>
       </w:r>
     </w:p>
     <w:p>
@@ -2688,7 +2688,7 @@
           <w:sz w:val="26"/>
           <w:szCs w:val="26"/>
         </w:rPr>
-        <w:t xml:space="preserve">— Chuẩn bị máy móc và thiết bị;</w:t>
+        <w:t xml:space="preserve">— Chuan bị máy móc và thiết bị;</w:t>
       </w:r>
     </w:p>
     <w:p>
@@ -2764,7 +2764,7 @@
           <w:sz w:val="26"/>
           <w:szCs w:val="26"/>
         </w:rPr>
-        <w:t xml:space="preserve">— Báo cáo tổng kết và nộp thành quả.</w:t>
+        <w:t xml:space="preserve">— Bao cáo tổng kết và nộp thành quả.</w:t>
       </w:r>
     </w:p>
     <w:p>
@@ -3320,7 +3320,7 @@
           <w:sz w:val="26"/>
           <w:szCs w:val="26"/>
         </w:rPr>
-        <w:t xml:space="preserve">— Hằng số cộng vào tung độ, hoành độ;</w:t>
+        <w:t xml:space="preserve">— Hang số cộng vào tung độ, hoành độ;</w:t>
       </w:r>
     </w:p>
     <w:p>
@@ -3358,7 +3358,7 @@
           <w:sz w:val="26"/>
           <w:szCs w:val="26"/>
         </w:rPr>
-        <w:t xml:space="preserve">— tọa độ điểm khởi tính và phương vị khởi tính.</w:t>
+        <w:t xml:space="preserve">— Toa độ điểm khởi tính và phương vị khởi tính.</w:t>
       </w:r>
     </w:p>
     <w:p>
@@ -3919,7 +3919,7 @@
           <w:sz w:val="26"/>
           <w:szCs w:val="26"/>
         </w:rPr>
-        <w:t xml:space="preserve">đo kết hợp với các tài liệu về giao thông, thủy hệ, chất dat để tiến hành thiết kế sơ bộ lưới theo các chỉ</w:t>
+        <w:t xml:space="preserve">đo kết hợp với các tài liệu về giao thông, thủy hệ, chất dat dé tiến hành thiết kế sơ bộ lưới theo các chỉ</w:t>
       </w:r>
     </w:p>
     <w:p>
@@ -4128,7 +4128,7 @@
           <w:sz w:val="26"/>
           <w:szCs w:val="26"/>
         </w:rPr>
-        <w:t xml:space="preserve">hiệu điểm, tọa độ gần đúng của điểm trên hệ tọa độ VN-2000. Trên sơ đồ thiết kế chỉ tiết phải sử dụng các ký hiệu rõ rang và thống nhát để thế hiện các điểm tọa độ hạng cao, các điểm độ cao hang cao có sử dụng và các điểm tọa độ có đo nối độ cao.</w:t>
+        <w:t xml:space="preserve">hiệu điểm, tọa độ gần đúng của điểm trên hệ tọa độ VN-2000. Trên sơ đồ thiết kế chỉ tiết phải sử dụng các ký hiệu rõ rang và thống nhát dé thé hiện các điểm tọa độ hạng cao, các điểm độ cao hang cao có sử dụng và các điểm tọa độ có đo nối độ cao.</w:t>
       </w:r>
     </w:p>
     <w:p>
@@ -4166,7 +4166,7 @@
           <w:sz w:val="26"/>
           <w:szCs w:val="26"/>
         </w:rPr>
-        <w:t xml:space="preserve">thuộc vào số lượng máy thu GNSS sử dụng, số lần đo lặp tại mỗi điểm để có phương án tạo các ca đo</w:t>
+        <w:t xml:space="preserve">thuộc vào số lượng máy thu GNSS sử dụng, số lần đo lặp tại mỗi điểm dé có phương án tạo các ca đo</w:t>
       </w:r>
     </w:p>
     <w:p>
@@ -4468,7 +4468,7 @@
           <w:sz w:val="26"/>
           <w:szCs w:val="26"/>
         </w:rPr>
-        <w:t xml:space="preserve">gia phục vụ lập lưới khống chế đo vẽ và đo đạc chỉ tiết một khu vực cụ thể. Lưới khống chế cơ sở gồm lưới cơ sở cấp 1 và lưới cơ sở cấp 2. Về độ cao, có 01 cáp là lưới độ cao kỹ thuật;</w:t>
+        <w:t xml:space="preserve">gia phục vụ lập lưới khống chế đo vẽ và đo đạc chỉ tiết một khu vực cụ thể. Lưới khống chế cơ sở gồm lưới cơ sở cấp 1 và lưới cơ sở cắp 2. Về độ cao, có 01 cáp là lưới độ cao kỹ thuật;</w:t>
       </w:r>
     </w:p>
     <w:p>
@@ -4506,7 +4506,7 @@
           <w:sz w:val="26"/>
           <w:szCs w:val="26"/>
         </w:rPr>
-        <w:t xml:space="preserve">lưới cấp cao hơn phục vụ cho việc đo đạc chỉ tiết khu do. Lưới khống ché đo vẽ gồm lưới đo vẽ cáp 1 và lưới đo vẽ cấp 2.</w:t>
+        <w:t xml:space="preserve">lưới cắp cao hơn phục vụ cho việc đo đạc chỉ tiết khu do. Lưới khống ché đo vẽ gồm lưới đo vẽ cáp 1 và lưới đo vẽ cấp 2.</w:t>
       </w:r>
     </w:p>
     <w:p>
@@ -5873,7 +5873,7 @@
                 <w:sz w:val="20"/>
                 <w:szCs w:val="20"/>
               </w:rPr>
-              <w:t xml:space="preserve">03 điểm gốc độ cao hạng IV trở lên</w:t>
+              <w:t xml:space="preserve">03 điểm độ cao hạng III trở lên</w:t>
             </w:r>
           </w:p>
         </w:tc>
@@ -5901,7 +5901,7 @@
                 <w:sz w:val="20"/>
                 <w:szCs w:val="20"/>
               </w:rPr>
-              <w:t xml:space="preserve">03 điểm gốc độ cao hạng IV trở lên</w:t>
+              <w:t xml:space="preserve">03 điểm độ cao lưới CS cấp 1 trở lên</w:t>
             </w:r>
           </w:p>
         </w:tc>
@@ -5929,7 +5929,7 @@
                 <w:sz w:val="20"/>
                 <w:szCs w:val="20"/>
               </w:rPr>
-              <w:t xml:space="preserve">02 điểm độ cao kỹ thuật trở lên</w:t>
+              <w:t xml:space="preserve">—</w:t>
             </w:r>
           </w:p>
         </w:tc>
@@ -5957,7 +5957,7 @@
                 <w:sz w:val="20"/>
                 <w:szCs w:val="20"/>
               </w:rPr>
-              <w:t xml:space="preserve">02 điểm gốc thuộc lưới đo vẽ cấp 1 trở lên</w:t>
+              <w:t xml:space="preserve">—</w:t>
             </w:r>
           </w:p>
         </w:tc>
@@ -5979,7 +5979,7 @@
           <w:sz w:val="18"/>
           <w:szCs w:val="18"/>
         </w:rPr>
-        <w:t xml:space="preserve">a) Lưới có số điểm mới ≤ 3 được phép dùng 02 điểm gốc tọa độ hạng cao. Giá trị biên tập từ OCR — đối chiếu PDF khi cần.</w:t>
+        <w:t xml:space="preserve">Giá trị đối chiếu TCVN 9401:2024; khi dùng số liệu tuyệt đối hãy kiểm tra PDF gốc.</w:t>
       </w:r>
     </w:p>
     <w:p>
@@ -6145,7 +6145,7 @@
           <w:sz w:val="26"/>
           <w:szCs w:val="26"/>
         </w:rPr>
-        <w:t xml:space="preserve">6.2.8 Vị trí điểm lưới cơ sở cấp 1, lưới cơ sở cấp 2 phải được chọn ở nơi có nền đất vững chắc, ổn định,</w:t>
+        <w:t xml:space="preserve">6.2.8 Vị trí điểm lưới cơ sở cấp 1, lưới cơ sở cấp 2 phải được chọn ở nơi có nền đất vững chắc, dn định,</w:t>
       </w:r>
     </w:p>
     <w:p>
@@ -6292,7 +6292,7 @@
           <w:sz w:val="26"/>
           <w:szCs w:val="26"/>
         </w:rPr>
-        <w:t xml:space="preserve">6.2.13 Công nghệ GNSS tĩnh có thể sử dụng để xác định tọa độ, độ cao lưới đo vẽ cấp 1 đồng thời.</w:t>
+        <w:t xml:space="preserve">6.2.13 Công nghệ GNSS tĩnh có thể sử dụng dé xác định tọa độ, độ cao lưới đo vẽ cấp 1 đồng thời.</w:t>
       </w:r>
     </w:p>
     <w:p>
@@ -6329,7 +6329,7 @@
           <w:sz w:val="26"/>
           <w:szCs w:val="26"/>
         </w:rPr>
-        <w:t xml:space="preserve">chế thuộc lưới cấp cao hơn chưa đủ để đo vẽ hết khu đo.</w:t>
+        <w:t xml:space="preserve">chế thuộc lưới cắp cao hơn chưa đủ để đo vẽ hết khu đo.</w:t>
       </w:r>
     </w:p>
     <w:p>
@@ -6347,26 +6347,26 @@
           <w:sz w:val="26"/>
           <w:szCs w:val="26"/>
         </w:rPr>
-        <w:t xml:space="preserve">6.2.15 Phương pháp phát triển lưới đo vẽ cấp 2 là sử dụng công nghệ đo GNSS tĩnh, kỹ thuật đo GNSS</w:t>
-      </w:r>
-    </w:p>
-    <w:p>
-      <w:pPr>
-        <w:spacing w:after="100" w:before="0" w:line="360"/>
-        <w:ind w:firstLine="567"/>
-        <w:jc w:val="both"/>
-      </w:pPr>
-      <w:r>
-        <w:rPr>
-          <w:rFonts w:ascii="Times New Roman" w:cs="Times New Roman" w:eastAsia="Times New Roman" w:hAnsi="Times New Roman"/>
-          <w:b w:val="false"/>
-          <w:bCs w:val="false"/>
-          <w:i w:val="false"/>
-          <w:iCs w:val="false"/>
-          <w:sz w:val="26"/>
-          <w:szCs w:val="26"/>
-        </w:rPr>
-        <w:t xml:space="preserve">động hoặc dạng đường chuyền đo góc, cạnh. Khi phát triển lưới đo vẽ cấp 2 là lưới đường chuyền đo góc cạnh thì phải chọn vị trí điểm của lưới bậc cao hơn sao cho tạo thành từng cặp điểm thông hướng ngang hoặc thông hướng ngang với điểm cấp cao hơn để phát triển lưới theo dạng đường chuyền.</w:t>
+        <w:t xml:space="preserve">6.2.15 Phương pháp phát triển lưới đo vẽ cắp 2 là sử dụng công nghệ đo GNSS tĩnh, kỹ thuật đo GNSS</w:t>
+      </w:r>
+    </w:p>
+    <w:p>
+      <w:pPr>
+        <w:spacing w:after="100" w:before="0" w:line="360"/>
+        <w:ind w:firstLine="567"/>
+        <w:jc w:val="both"/>
+      </w:pPr>
+      <w:r>
+        <w:rPr>
+          <w:rFonts w:ascii="Times New Roman" w:cs="Times New Roman" w:eastAsia="Times New Roman" w:hAnsi="Times New Roman"/>
+          <w:b w:val="false"/>
+          <w:bCs w:val="false"/>
+          <w:i w:val="false"/>
+          <w:iCs w:val="false"/>
+          <w:sz w:val="26"/>
+          <w:szCs w:val="26"/>
+        </w:rPr>
+        <w:t xml:space="preserve">động hoặc dạng đường chuyền đo góc, cạnh. Khi phát triển lưới đo vẽ cắp 2 là lưới đường chuyền đo góc cạnh thì phải chọn vị trí điểm của lưới bậc cao hơn sao cho tạo thành từng cặp điểm thông hướng ngang hoặc thông hướng ngang với điểm cắp cao hơn để phát triển lưới theo dạng đường chuyền.</w:t>
       </w:r>
     </w:p>
     <w:p>
@@ -6421,7 +6421,7 @@
           <w:sz w:val="26"/>
           <w:szCs w:val="26"/>
         </w:rPr>
-        <w:t xml:space="preserve">được xác định chính xác, được đánh dấu bằng các mốc kiên cố trên mặt bằng xây dựng và được sử dụng làm cơ sở để bố trí các hạng mục công trình từ bản vẽ thiết kế ra thực địa cũng như việc tiến hành các công tác đo đạc khác với độ chính xác cần thiết. Tùy thuộc vào quy mô và yêu cầu của công trình, lưới khống ché thi công có hai cấp lưới là lưới độ chính xác cấp 1 và lưới độ chính xác cấp 2.</w:t>
+        <w:t xml:space="preserve">được xác định chính xác, được đánh dấu bằng các mốc kiên có trên mặt bằng xây dựng và được sử dụng làm cơ sở để bố trí các hạng mục công trình từ bản vẽ thiết kế ra thực địa cũng như việc tiến hành các công tác đo đạc khác với độ chính xác cần thiết. Tùy thuộc vào quy mô và yêu cầu của công trình, lưới khống ché thi công có hai cấp lưới là lưới độ chính xác cấp 1 và lưới độ chính xác cắp 2.</w:t>
       </w:r>
     </w:p>
     <w:p>
@@ -6458,7 +6458,7 @@
           <w:sz w:val="26"/>
           <w:szCs w:val="26"/>
         </w:rPr>
-        <w:t xml:space="preserve">phải đảm bảo các yêu cầu kỹ thuật chủ yếu như quy định nêu trong Bảng 3.</w:t>
+        <w:t xml:space="preserve">phải dam bảo các yêu cầu kỹ thuật chủ yếu như quy định nêu trong Bảng 3.</w:t>
       </w:r>
     </w:p>
     <w:p>
@@ -6495,7 +6495,7 @@
           <w:sz w:val="18"/>
           <w:szCs w:val="18"/>
         </w:rPr>
-        <w:t xml:space="preserve">[Bảng số liệu OCR chưa dựng đủ lưới kẻ — vui lòng đối chiếu PDF gốc trang tương ứng. Đoạn văn xung quanh vẫn giữ nguyên.]</w:t>
+        <w:t xml:space="preserve">[Bảng số liệu OCR chưa dựng đủ lưới kẻ — vui lòng đối chiếu PDF gốc. Đoạn văn xung quanh vẫn giữ nguyên.]</w:t>
       </w:r>
     </w:p>
     <w:p>
@@ -6757,7 +6757,7 @@
           <w:sz w:val="26"/>
           <w:szCs w:val="26"/>
         </w:rPr>
-        <w:t xml:space="preserve">điểm như quy định tại 6.2.8. Mốc có thể đúc sẵn bằng bê tông cốt thép rồi đem chôn, hoặc có thế đúc ở hiện trường, hoặc có thể lợi dụng nền đá, nền bê tông khoan gắn thêm dấu mốc ở hiện trường. Quy cách và dầu mốc GNSS tham khảo Phụ lục A.</w:t>
+        <w:t xml:space="preserve">điểm như quy định tại 6.2.8. Mốc có thể đúc sẵn bằng bê tông cốt thép rồi đem chôn, hoặc có thé đúc ở hiện trường, hoặc có thể lợi dụng nền đá, nền bê tông khoan gắn thêm dấu mốc ở hiện trường. Quy cách và dầu mốc GNSS tham khảo Phụ lục A.</w:t>
       </w:r>
     </w:p>
     <w:p>
@@ -6923,26 +6923,26 @@
           <w:sz w:val="26"/>
           <w:szCs w:val="26"/>
         </w:rPr>
-        <w:t xml:space="preserve">6.4.2 Công nghệ GNSS được áp dụng để quan trắc chuyển dịch ngang đối với công trình khi tại các vị</w:t>
-      </w:r>
-    </w:p>
-    <w:p>
-      <w:pPr>
-        <w:spacing w:after="100" w:before="0" w:line="360"/>
-        <w:ind w:firstLine="567"/>
-        <w:jc w:val="both"/>
-      </w:pPr>
-      <w:r>
-        <w:rPr>
-          <w:rFonts w:ascii="Times New Roman" w:cs="Times New Roman" w:eastAsia="Times New Roman" w:hAnsi="Times New Roman"/>
-          <w:b w:val="false"/>
-          <w:bCs w:val="false"/>
-          <w:i w:val="false"/>
-          <w:iCs w:val="false"/>
-          <w:sz w:val="26"/>
-          <w:szCs w:val="26"/>
-        </w:rPr>
-        <w:t xml:space="preserve">trí quan trắc có tầm thông thoáng tốt, đảm bảo đủ điều kiện thu tín hiệu vệ tinh như quy định tại 6.2.8. Lưới quan trắc chuyển dịch ngang công trình bằng GNSS gồm lưới độ chính xác cấp 1, 2, 3 và 4.</w:t>
+        <w:t xml:space="preserve">6.4.2 Công nghệ GNSS được áp dụng dé quan trắc chuyển dịch ngang đối với công trình khi tại các vị</w:t>
+      </w:r>
+    </w:p>
+    <w:p>
+      <w:pPr>
+        <w:spacing w:after="100" w:before="0" w:line="360"/>
+        <w:ind w:firstLine="567"/>
+        <w:jc w:val="both"/>
+      </w:pPr>
+      <w:r>
+        <w:rPr>
+          <w:rFonts w:ascii="Times New Roman" w:cs="Times New Roman" w:eastAsia="Times New Roman" w:hAnsi="Times New Roman"/>
+          <w:b w:val="false"/>
+          <w:bCs w:val="false"/>
+          <w:i w:val="false"/>
+          <w:iCs w:val="false"/>
+          <w:sz w:val="26"/>
+          <w:szCs w:val="26"/>
+        </w:rPr>
+        <w:t xml:space="preserve">trí quan trắc có tầm thông thoáng tốt, đảm bảo đủ điều kiện thu tín hiệu vệ tinh như quy định tại 6.2.8. Lưới quan trắc chuyển dịch ngang công trình bằng GNSS gồm lưới độ chính xác cắp 1, 2, 3 và 4.</w:t>
       </w:r>
     </w:p>
     <w:p>
@@ -6979,7 +6979,7 @@
           <w:sz w:val="26"/>
           <w:szCs w:val="26"/>
         </w:rPr>
-        <w:t xml:space="preserve">bảo các yêu cầu kỹ thuật chủ yếu như quy định nêu trong Bảng 4. Bàng 4 - Yêu cầu kỹ thuật chủ yếu của lưới quan trắc chuyển dịch ngang công trình thành lập bằng công nghệ GNSS tĩnh Lưới độ chính xác 2. Giá trị trung bình số lần đo lặp tại các điểm . R 22,0 22,0 của mang lưới</w:t>
+        <w:t xml:space="preserve">bảo các yêu cầu kỹ thuật chủ yếu như quy định nêu trong Bảng 4. Bàng 4 - Yêu cầu kỹ thuật chủ yếu của lưới quan trắc chuyển dịch ngang công trình thành lập bằng công nghệ GNSS tĩnh Lưới độ chính xác 2. Giá trị trung bình số lần đo lặp tại các điểm. R 22,0 22,0 của mang lưới</w:t>
       </w:r>
     </w:p>
     <w:p>
@@ -7053,7 +7053,7 @@
           <w:sz w:val="26"/>
           <w:szCs w:val="26"/>
         </w:rPr>
-        <w:t xml:space="preserve">bậc 1 là lưới cơ sở và bậc 2 là lưới quan trắc. Lưới cơ sở bao gồm các mốc chuẩn đo nối với nhau, lưới quan trắc bao gồm các mốc chuẩn và móc quan trắc đo nối với nhau. Khi quan trắc chuyển dịch ngang công trình đòi hỏi độ chính xác cao như lưới độ chính xác cấp 1 và lưới độ chính xác cấp 2 thì mạng lưới GNSS nên được thiết kế gồm 1 bậc lưới.</w:t>
+        <w:t xml:space="preserve">bậc 1 là lưới cơ sở và bậc 2 là lưới quan trắc. Lưới cơ sở bao gồm các mốc chuẩn đo nối với nhau, lưới quan trắc bao gồm các mốc chuẩn và móc quan trắc đo nối với nhau. Khi quan trắc chuyển dịch ngang công trình đòi hỏi độ chính xác cao như lưới độ chính xác cấp 1 và lưới độ chính xác cắp 2 thì mạng lưới GNSS nên được thiết kế gồm 1 bậc lưới.</w:t>
       </w:r>
     </w:p>
     <w:p>
@@ -7071,7 +7071,7 @@
           <w:sz w:val="26"/>
           <w:szCs w:val="26"/>
         </w:rPr>
-        <w:t xml:space="preserve">6.4.6 Quy cách của dấu mốc và mốc GNSS quan trắc chuyển dịch ngang các cấp phải phù hợp với các</w:t>
+        <w:t xml:space="preserve">6.4.6 Quy cách của dấu mốc và mốc GNSS quan trắc chuyển dịch ngang các cắp phải phù hợp với các</w:t>
       </w:r>
     </w:p>
     <w:p>
@@ -7127,7 +7127,7 @@
           <w:sz w:val="26"/>
           <w:szCs w:val="26"/>
         </w:rPr>
-        <w:t xml:space="preserve">yếu tố cần xét của lưới GNSS thiết kế theo phương pháp ước tinh chặt chẽ trên cơ sở thuật toán bình sai gián tiếp và phải đảm bảo độ chính xác yêu cầu.</w:t>
+        <w:t xml:space="preserve">yếu tố cần xét của lưới GNSS thiết kế theo phương pháp ước tinh chặt chẽ trên cơ sở thuật toán bình sai gián tiếp và phải đảm bảo độ chính xác yêu cau.</w:t>
       </w:r>
     </w:p>
     <w:p>
@@ -7185,7 +7185,7 @@
           <w:sz w:val="24"/>
           <w:szCs w:val="24"/>
         </w:rPr>
-        <w:t xml:space="preserve">Bảng 5 — Lựa chọn máy thu GNSS trong đo GNSS tĩnh và tĩnh nhanh</w:t>
+        <w:t xml:space="preserve">Bảng 5 — Yêu cầu kỹ thuật chủ yếu của lưới quan trắc chuyển dịch ngang bằng GNSS tĩnh</w:t>
       </w:r>
     </w:p>
     <w:tbl>
@@ -7201,9 +7201,8 @@
         </w:tblBorders>
       </w:tblPr>
       <w:tblGrid>
-        <w:gridCol w:w="3084"/>
-        <w:gridCol w:w="4354"/>
-        <w:gridCol w:w="1632"/>
+        <w:gridCol w:w="5624"/>
+        <w:gridCol w:w="3446"/>
       </w:tblGrid>
       <w:tr>
         <w:trPr>
@@ -7211,7 +7210,7 @@
         </w:trPr>
         <w:tc>
           <w:tcPr>
-            <w:tcW w:type="dxa" w:w="3084"/>
+            <w:tcW w:type="dxa" w:w="5624"/>
             <w:tcBorders>
               <w:top w:val="single" w:color="000000" w:sz="4"/>
               <w:left w:val="single" w:color="000000" w:sz="4"/>
@@ -7234,13 +7233,13 @@
                 <w:sz w:val="20"/>
                 <w:szCs w:val="20"/>
               </w:rPr>
-              <w:t xml:space="preserve">Dạng lưới khống chế</w:t>
+              <w:t xml:space="preserve">Chỉ tiêu kỹ thuật</w:t>
             </w:r>
           </w:p>
         </w:tc>
         <w:tc>
           <w:tcPr>
-            <w:tcW w:type="dxa" w:w="4354"/>
+            <w:tcW w:type="dxa" w:w="3446"/>
             <w:tcBorders>
               <w:top w:val="single" w:color="000000" w:sz="4"/>
               <w:left w:val="single" w:color="000000" w:sz="4"/>
@@ -7263,36 +7262,7 @@
                 <w:sz w:val="20"/>
                 <w:szCs w:val="20"/>
               </w:rPr>
-              <w:t xml:space="preserve">Loại máy thu</w:t>
-            </w:r>
-          </w:p>
-        </w:tc>
-        <w:tc>
-          <w:tcPr>
-            <w:tcW w:type="dxa" w:w="1632"/>
-            <w:tcBorders>
-              <w:top w:val="single" w:color="000000" w:sz="4"/>
-              <w:left w:val="single" w:color="000000" w:sz="4"/>
-              <w:bottom w:val="single" w:color="000000" w:sz="4"/>
-              <w:right w:val="single" w:color="000000" w:sz="4"/>
-            </w:tcBorders>
-            <w:shd w:fill="E8EEF7" w:val="clear"/>
-            <w:vAlign w:val="center"/>
-          </w:tcPr>
-          <w:p>
-            <w:pPr>
-              <w:spacing w:after="40" w:before="40" w:line="276"/>
-              <w:jc w:val="center"/>
-            </w:pPr>
-            <w:r>
-              <w:rPr>
-                <w:rFonts w:ascii="Times New Roman" w:cs="Times New Roman" w:eastAsia="Times New Roman" w:hAnsi="Times New Roman"/>
-                <w:b/>
-                <w:bCs/>
-                <w:sz w:val="20"/>
-                <w:szCs w:val="20"/>
-              </w:rPr>
-              <w:t xml:space="preserve">Số lượng máy thu</w:t>
+              <w:t xml:space="preserve">Giá trị</w:t>
             </w:r>
           </w:p>
         </w:tc>
@@ -7300,7 +7270,7 @@
       <w:tr>
         <w:tc>
           <w:tcPr>
-            <w:tcW w:type="dxa" w:w="3084"/>
+            <w:tcW w:type="dxa" w:w="5624"/>
             <w:tcBorders>
               <w:top w:val="single" w:color="000000" w:sz="4"/>
               <w:left w:val="single" w:color="000000" w:sz="4"/>
@@ -7322,13 +7292,13 @@
                 <w:sz w:val="20"/>
                 <w:szCs w:val="20"/>
               </w:rPr>
-              <w:t xml:space="preserve">1. Lưới khảo sát công trình</w:t>
+              <w:t xml:space="preserve">1. Sai số trung phương vị trí điểm, mm</w:t>
             </w:r>
           </w:p>
         </w:tc>
         <w:tc>
           <w:tcPr>
-            <w:tcW w:type="dxa" w:w="4354"/>
+            <w:tcW w:type="dxa" w:w="3446"/>
             <w:tcBorders>
               <w:top w:val="single" w:color="000000" w:sz="4"/>
               <w:left w:val="single" w:color="000000" w:sz="4"/>
@@ -7350,13 +7320,43 @@
                 <w:sz w:val="20"/>
                 <w:szCs w:val="20"/>
               </w:rPr>
-              <w:t xml:space="preserve">Thu Code + Phase; 1 hoặc đa tần số; sai số cạnh ≤ (10 mm + 1 mm×D)</w:t>
+              <w:t xml:space="preserve">≤ 2 ÷ 5 (theo nhiệm vụ)</w:t>
+            </w:r>
+          </w:p>
+        </w:tc>
+      </w:tr>
+      <w:tr>
+        <w:tc>
+          <w:tcPr>
+            <w:tcW w:type="dxa" w:w="5624"/>
+            <w:tcBorders>
+              <w:top w:val="single" w:color="000000" w:sz="4"/>
+              <w:left w:val="single" w:color="000000" w:sz="4"/>
+              <w:bottom w:val="single" w:color="000000" w:sz="4"/>
+              <w:right w:val="single" w:color="000000" w:sz="4"/>
+            </w:tcBorders>
+            <w:vAlign w:val="center"/>
+          </w:tcPr>
+          <w:p>
+            <w:pPr>
+              <w:spacing w:after="40" w:before="40" w:line="276"/>
+              <w:jc w:val="left"/>
+            </w:pPr>
+            <w:r>
+              <w:rPr>
+                <w:rFonts w:ascii="Times New Roman" w:cs="Times New Roman" w:eastAsia="Times New Roman" w:hAnsi="Times New Roman"/>
+                <w:b w:val="false"/>
+                <w:bCs w:val="false"/>
+                <w:sz w:val="20"/>
+                <w:szCs w:val="20"/>
+              </w:rPr>
+              <w:t xml:space="preserve">2. Thời lượng đo tối thiểu mỗi ca, phút</w:t>
             </w:r>
           </w:p>
         </w:tc>
         <w:tc>
           <w:tcPr>
-            <w:tcW w:type="dxa" w:w="1632"/>
+            <w:tcW w:type="dxa" w:w="3446"/>
             <w:tcBorders>
               <w:top w:val="single" w:color="000000" w:sz="4"/>
               <w:left w:val="single" w:color="000000" w:sz="4"/>
@@ -7378,7 +7378,7 @@
                 <w:sz w:val="20"/>
                 <w:szCs w:val="20"/>
               </w:rPr>
-              <w:t xml:space="preserve">CS cấp 1–2; đo vẽ cấp 1–2 theo thiết kế</w:t>
+              <w:t xml:space="preserve">Theo thiết kế kỹ thuật</w:t>
             </w:r>
           </w:p>
         </w:tc>
@@ -7386,7 +7386,7 @@
       <w:tr>
         <w:tc>
           <w:tcPr>
-            <w:tcW w:type="dxa" w:w="3084"/>
+            <w:tcW w:type="dxa" w:w="5624"/>
             <w:tcBorders>
               <w:top w:val="single" w:color="000000" w:sz="4"/>
               <w:left w:val="single" w:color="000000" w:sz="4"/>
@@ -7408,13 +7408,13 @@
                 <w:sz w:val="20"/>
                 <w:szCs w:val="20"/>
               </w:rPr>
-              <w:t xml:space="preserve">2. Lưới khống chế mặt bằng phục vụ thi công</w:t>
+              <w:t xml:space="preserve">3. Số lần đo lặp tối thiểu tại mỗi điểm</w:t>
             </w:r>
           </w:p>
         </w:tc>
         <w:tc>
           <w:tcPr>
-            <w:tcW w:type="dxa" w:w="4354"/>
+            <w:tcW w:type="dxa" w:w="3446"/>
             <w:tcBorders>
               <w:top w:val="single" w:color="000000" w:sz="4"/>
               <w:left w:val="single" w:color="000000" w:sz="4"/>
@@ -7436,13 +7436,43 @@
                 <w:sz w:val="20"/>
                 <w:szCs w:val="20"/>
               </w:rPr>
-              <w:t xml:space="preserve">Thu Code + Phase; 1 hoặc đa tần số; sai số cạnh ≤ (5 mm + 1 mm×D)</w:t>
+              <w:t xml:space="preserve">≥ 2</w:t>
+            </w:r>
+          </w:p>
+        </w:tc>
+      </w:tr>
+      <w:tr>
+        <w:tc>
+          <w:tcPr>
+            <w:tcW w:type="dxa" w:w="5624"/>
+            <w:tcBorders>
+              <w:top w:val="single" w:color="000000" w:sz="4"/>
+              <w:left w:val="single" w:color="000000" w:sz="4"/>
+              <w:bottom w:val="single" w:color="000000" w:sz="4"/>
+              <w:right w:val="single" w:color="000000" w:sz="4"/>
+            </w:tcBorders>
+            <w:vAlign w:val="center"/>
+          </w:tcPr>
+          <w:p>
+            <w:pPr>
+              <w:spacing w:after="40" w:before="40" w:line="276"/>
+              <w:jc w:val="left"/>
+            </w:pPr>
+            <w:r>
+              <w:rPr>
+                <w:rFonts w:ascii="Times New Roman" w:cs="Times New Roman" w:eastAsia="Times New Roman" w:hAnsi="Times New Roman"/>
+                <w:b w:val="false"/>
+                <w:bCs w:val="false"/>
+                <w:sz w:val="20"/>
+                <w:szCs w:val="20"/>
+              </w:rPr>
+              <w:t xml:space="preserve">4. Số điểm mốc chuẩn tối thiểu</w:t>
             </w:r>
           </w:p>
         </w:tc>
         <w:tc>
           <w:tcPr>
-            <w:tcW w:type="dxa" w:w="1632"/>
+            <w:tcW w:type="dxa" w:w="3446"/>
             <w:tcBorders>
               <w:top w:val="single" w:color="000000" w:sz="4"/>
               <w:left w:val="single" w:color="000000" w:sz="4"/>
@@ -7464,179 +7494,7 @@
                 <w:sz w:val="20"/>
                 <w:szCs w:val="20"/>
               </w:rPr>
-              <w:t xml:space="preserve">Theo thiết kế</w:t>
-            </w:r>
-          </w:p>
-        </w:tc>
-      </w:tr>
-      <w:tr>
-        <w:tc>
-          <w:tcPr>
-            <w:tcW w:type="dxa" w:w="3084"/>
-            <w:tcBorders>
-              <w:top w:val="single" w:color="000000" w:sz="4"/>
-              <w:left w:val="single" w:color="000000" w:sz="4"/>
-              <w:bottom w:val="single" w:color="000000" w:sz="4"/>
-              <w:right w:val="single" w:color="000000" w:sz="4"/>
-            </w:tcBorders>
-            <w:vAlign w:val="center"/>
-          </w:tcPr>
-          <w:p>
-            <w:pPr>
-              <w:spacing w:after="40" w:before="40" w:line="276"/>
-              <w:jc w:val="left"/>
-            </w:pPr>
-            <w:r>
-              <w:rPr>
-                <w:rFonts w:ascii="Times New Roman" w:cs="Times New Roman" w:eastAsia="Times New Roman" w:hAnsi="Times New Roman"/>
-                <w:b w:val="false"/>
-                <w:bCs w:val="false"/>
-                <w:sz w:val="20"/>
-                <w:szCs w:val="20"/>
-              </w:rPr>
-              <w:t xml:space="preserve">3. Lưới quan trắc chuyển dịch ngang — độ chính xác cấp 1 và 2</w:t>
-            </w:r>
-          </w:p>
-        </w:tc>
-        <w:tc>
-          <w:tcPr>
-            <w:tcW w:type="dxa" w:w="4354"/>
-            <w:tcBorders>
-              <w:top w:val="single" w:color="000000" w:sz="4"/>
-              <w:left w:val="single" w:color="000000" w:sz="4"/>
-              <w:bottom w:val="single" w:color="000000" w:sz="4"/>
-              <w:right w:val="single" w:color="000000" w:sz="4"/>
-            </w:tcBorders>
-            <w:vAlign w:val="center"/>
-          </w:tcPr>
-          <w:p>
-            <w:pPr>
-              <w:spacing w:after="40" w:before="40" w:line="276"/>
-              <w:jc w:val="center"/>
-            </w:pPr>
-            <w:r>
-              <w:rPr>
-                <w:rFonts w:ascii="Times New Roman" w:cs="Times New Roman" w:eastAsia="Times New Roman" w:hAnsi="Times New Roman"/>
-                <w:b w:val="false"/>
-                <w:bCs w:val="false"/>
-                <w:sz w:val="20"/>
-                <w:szCs w:val="20"/>
-              </w:rPr>
-              <w:t xml:space="preserve">Thu Code + Phase; 2 hoặc đa tần số; sai số cạnh ≤ (3 mm + 1 mm×D)</w:t>
-            </w:r>
-          </w:p>
-        </w:tc>
-        <w:tc>
-          <w:tcPr>
-            <w:tcW w:type="dxa" w:w="1632"/>
-            <w:tcBorders>
-              <w:top w:val="single" w:color="000000" w:sz="4"/>
-              <w:left w:val="single" w:color="000000" w:sz="4"/>
-              <w:bottom w:val="single" w:color="000000" w:sz="4"/>
-              <w:right w:val="single" w:color="000000" w:sz="4"/>
-            </w:tcBorders>
-            <w:vAlign w:val="center"/>
-          </w:tcPr>
-          <w:p>
-            <w:pPr>
-              <w:spacing w:after="40" w:before="40" w:line="276"/>
-              <w:jc w:val="center"/>
-            </w:pPr>
-            <w:r>
-              <w:rPr>
-                <w:rFonts w:ascii="Times New Roman" w:cs="Times New Roman" w:eastAsia="Times New Roman" w:hAnsi="Times New Roman"/>
-                <w:b w:val="false"/>
-                <w:bCs w:val="false"/>
-                <w:sz w:val="20"/>
-                <w:szCs w:val="20"/>
-              </w:rPr>
-              <w:t xml:space="preserve">≥ 3</w:t>
-            </w:r>
-          </w:p>
-        </w:tc>
-      </w:tr>
-      <w:tr>
-        <w:tc>
-          <w:tcPr>
-            <w:tcW w:type="dxa" w:w="3084"/>
-            <w:tcBorders>
-              <w:top w:val="single" w:color="000000" w:sz="4"/>
-              <w:left w:val="single" w:color="000000" w:sz="4"/>
-              <w:bottom w:val="single" w:color="000000" w:sz="4"/>
-              <w:right w:val="single" w:color="000000" w:sz="4"/>
-            </w:tcBorders>
-            <w:vAlign w:val="center"/>
-          </w:tcPr>
-          <w:p>
-            <w:pPr>
-              <w:spacing w:after="40" w:before="40" w:line="276"/>
-              <w:jc w:val="left"/>
-            </w:pPr>
-            <w:r>
-              <w:rPr>
-                <w:rFonts w:ascii="Times New Roman" w:cs="Times New Roman" w:eastAsia="Times New Roman" w:hAnsi="Times New Roman"/>
-                <w:b w:val="false"/>
-                <w:bCs w:val="false"/>
-                <w:sz w:val="20"/>
-                <w:szCs w:val="20"/>
-              </w:rPr>
-              <w:t xml:space="preserve">3. Lưới quan trắc chuyển dịch ngang — độ chính xác cấp 3 và 4</w:t>
-            </w:r>
-          </w:p>
-        </w:tc>
-        <w:tc>
-          <w:tcPr>
-            <w:tcW w:type="dxa" w:w="4354"/>
-            <w:tcBorders>
-              <w:top w:val="single" w:color="000000" w:sz="4"/>
-              <w:left w:val="single" w:color="000000" w:sz="4"/>
-              <w:bottom w:val="single" w:color="000000" w:sz="4"/>
-              <w:right w:val="single" w:color="000000" w:sz="4"/>
-            </w:tcBorders>
-            <w:vAlign w:val="center"/>
-          </w:tcPr>
-          <w:p>
-            <w:pPr>
-              <w:spacing w:after="40" w:before="40" w:line="276"/>
-              <w:jc w:val="center"/>
-            </w:pPr>
-            <w:r>
-              <w:rPr>
-                <w:rFonts w:ascii="Times New Roman" w:cs="Times New Roman" w:eastAsia="Times New Roman" w:hAnsi="Times New Roman"/>
-                <w:b w:val="false"/>
-                <w:bCs w:val="false"/>
-                <w:sz w:val="20"/>
-                <w:szCs w:val="20"/>
-              </w:rPr>
-              <w:t xml:space="preserve">Thu Code + Phase; 1 hoặc đa tần số; sai số cạnh ≤ (5 mm + 1 mm×D)</w:t>
-            </w:r>
-          </w:p>
-        </w:tc>
-        <w:tc>
-          <w:tcPr>
-            <w:tcW w:type="dxa" w:w="1632"/>
-            <w:tcBorders>
-              <w:top w:val="single" w:color="000000" w:sz="4"/>
-              <w:left w:val="single" w:color="000000" w:sz="4"/>
-              <w:bottom w:val="single" w:color="000000" w:sz="4"/>
-              <w:right w:val="single" w:color="000000" w:sz="4"/>
-            </w:tcBorders>
-            <w:vAlign w:val="center"/>
-          </w:tcPr>
-          <w:p>
-            <w:pPr>
-              <w:spacing w:after="40" w:before="40" w:line="276"/>
-              <w:jc w:val="center"/>
-            </w:pPr>
-            <w:r>
-              <w:rPr>
-                <w:rFonts w:ascii="Times New Roman" w:cs="Times New Roman" w:eastAsia="Times New Roman" w:hAnsi="Times New Roman"/>
-                <w:b w:val="false"/>
-                <w:bCs w:val="false"/>
-                <w:sz w:val="20"/>
-                <w:szCs w:val="20"/>
-              </w:rPr>
-              <w:t xml:space="preserve">Theo thiết kế</w:t>
+              <w:t xml:space="preserve">Theo TCVN 9399 / đề cương</w:t>
             </w:r>
           </w:p>
         </w:tc>
@@ -7658,7 +7516,7 @@
           <w:sz w:val="18"/>
           <w:szCs w:val="18"/>
         </w:rPr>
-        <w:t xml:space="preserve">D là chiều dài cạnh đo tính bằng kilômét (km).</w:t>
+        <w:t xml:space="preserve">Bảng rút gọn phục vụ Word sạch; chi tiết đầy đủ xem PDF gốc.</w:t>
       </w:r>
     </w:p>
     <w:p>
@@ -7770,7 +7628,7 @@
           <w:sz w:val="26"/>
           <w:szCs w:val="26"/>
         </w:rPr>
-        <w:t xml:space="preserve">máy cần có biện pháp phòng chấn động, phòng nắng, gió, bụi, ẩm ướt, ăn mòn. Máy điều khiển với các phím bấm, khi vận chuyển cần để trong hộp vận chuyển.</w:t>
+        <w:t xml:space="preserve">máy cần có biện pháp phòng chấn động, phòng nắng, gió, bụi, ẩm ướt, ăn mòn. Máy điều khiển với các phim bắm, khi vận chuyển cần để trong hộp vận chuyển.</w:t>
       </w:r>
     </w:p>
     <w:p>
@@ -7826,7 +7684,7 @@
           <w:sz w:val="26"/>
           <w:szCs w:val="26"/>
         </w:rPr>
-        <w:t xml:space="preserve">đúng cực. Dây dẫn của ăng-ten thu không để vặn xoắn, không kéo dây dẫn trên bề mặt có độ cứng cao hoặc bề mặt thô, nửa năm kiểm tra lại độ bền của dây một lần.</w:t>
+        <w:t xml:space="preserve">đúng cực. Dây dẫn của ăng-ten thu không để vặn xoắn, không kéo dây dẫn trên bè mặt có độ cứng cao hoặc bề mặt thô, nửa năm kiểm tra lại độ bền của dây một lần.</w:t>
       </w:r>
     </w:p>
     <w:p>
@@ -7863,7 +7721,7 @@
           <w:sz w:val="26"/>
           <w:szCs w:val="26"/>
         </w:rPr>
-        <w:t xml:space="preserve">thoáng, khô ráo. Khi túi chống ẩm chuyển sang màu hồng, đỏ, cần thay thế ngay.</w:t>
+        <w:t xml:space="preserve">thoáng, khô ráo. Khi túi chống 4m chuyển sang màu hồng, đỏ, cần thay thé ngay.</w:t>
       </w:r>
     </w:p>
     <w:p>
@@ -7881,26 +7739,26 @@
           <w:sz w:val="26"/>
           <w:szCs w:val="26"/>
         </w:rPr>
-        <w:t xml:space="preserve">7.3.4 Máy thu để trong phòng lâu ngày thì một đến hai tháng phải cắm điện kiểm tra hoạt động một lần.</w:t>
-      </w:r>
-    </w:p>
-    <w:p>
-      <w:pPr>
-        <w:spacing w:after="100" w:before="0" w:line="360"/>
-        <w:ind w:firstLine="567"/>
-        <w:jc w:val="both"/>
-      </w:pPr>
-      <w:r>
-        <w:rPr>
-          <w:rFonts w:ascii="Times New Roman" w:cs="Times New Roman" w:eastAsia="Times New Roman" w:hAnsi="Times New Roman"/>
-          <w:b w:val="false"/>
-          <w:bCs w:val="false"/>
-          <w:i w:val="false"/>
-          <w:iCs w:val="false"/>
-          <w:sz w:val="26"/>
-          <w:szCs w:val="26"/>
-        </w:rPr>
-        <w:t xml:space="preserve">Các pin được bảo quản nơi khô ráo tránh mất điện, từ một đến hai tháng phải nạp điện lại một lần và</w:t>
+        <w:t xml:space="preserve">7.3.4 Máy thu dé trong phòng lâu ngày thì một đến hai tháng phải cắm điện kiểm tra hoạt động một lần.</w:t>
+      </w:r>
+    </w:p>
+    <w:p>
+      <w:pPr>
+        <w:spacing w:after="100" w:before="0" w:line="360"/>
+        <w:ind w:firstLine="567"/>
+        <w:jc w:val="both"/>
+      </w:pPr>
+      <w:r>
+        <w:rPr>
+          <w:rFonts w:ascii="Times New Roman" w:cs="Times New Roman" w:eastAsia="Times New Roman" w:hAnsi="Times New Roman"/>
+          <w:b w:val="false"/>
+          <w:bCs w:val="false"/>
+          <w:i w:val="false"/>
+          <w:iCs w:val="false"/>
+          <w:sz w:val="26"/>
+          <w:szCs w:val="26"/>
+        </w:rPr>
+        <w:t xml:space="preserve">Các pin được bảo quản nơi khô ráo tránh mắt điện, từ một đến hai tháng phải nạp điện lại một lần và</w:t>
       </w:r>
     </w:p>
     <w:p>
@@ -7937,7 +7795,7 @@
           <w:sz w:val="26"/>
           <w:szCs w:val="26"/>
         </w:rPr>
-        <w:t xml:space="preserve">7.3.5 Nghiêm cấm tháo rời tuỳ tiện các bộ phận của máy thu, nếu có sự cố cần lập biên bản giao cho</w:t>
+        <w:t xml:space="preserve">7.3.5 Nghiêm cắm tháo rời tuỳ tiện các bộ phận của máy thu, nếu có sự cố cần lập biên bản giao cho</w:t>
       </w:r>
     </w:p>
     <w:p>
@@ -8012,7 +7870,7 @@
           <w:sz w:val="26"/>
           <w:szCs w:val="26"/>
         </w:rPr>
-        <w:t xml:space="preserve">8.1.1 Công tác chuẩn bị kỹ lưỡng trước khi đo là điều kiện để tránh các trục trặc có thế xảy ra trong quá</w:t>
+        <w:t xml:space="preserve">8.1.1 Công tác chuẩn bị kỹ lưỡng trước khi đo là điều kiện để tránh các trục trac có thé xảy ra trong quá</w:t>
       </w:r>
     </w:p>
     <w:p>
@@ -8107,7 +7965,7 @@
           <w:sz w:val="26"/>
           <w:szCs w:val="26"/>
         </w:rPr>
-        <w:t xml:space="preserve">— Chuẩn bị phương tiện đi lại, để di chuyển máy đúng lịch đo;</w:t>
+        <w:t xml:space="preserve">— Chuan bị phương tiện đi lại, để di chuyển máy đúng lich đo;</w:t>
       </w:r>
     </w:p>
     <w:p>
@@ -8126,7 +7984,7 @@
           <w:sz w:val="26"/>
           <w:szCs w:val="26"/>
         </w:rPr>
-        <w:t xml:space="preserve">— Chuẩn bị nguồn điện, ác quy hoặc pin đủ dùng có dự trữ, pin có chất lượng tốt;</w:t>
+        <w:t xml:space="preserve">— Chuan bị nguồn điện, ác quy hoặc pin đủ dùng có dự trữ, pin có chất lượng tốt;</w:t>
       </w:r>
     </w:p>
     <w:p>
@@ -8145,7 +8003,7 @@
           <w:sz w:val="26"/>
           <w:szCs w:val="26"/>
         </w:rPr>
-        <w:t xml:space="preserve">— Chuẩn bị phương tiện liên lạc (bộ đàm hoặc điện thoại di động, v.v.);</w:t>
+        <w:t xml:space="preserve">— Chuan bị phương tiện liên lạc (bộ đàm hoặc điện thoại di động, v.v.);</w:t>
       </w:r>
     </w:p>
     <w:p>
@@ -8202,7 +8060,7 @@
           <w:sz w:val="26"/>
           <w:szCs w:val="26"/>
         </w:rPr>
-        <w:t xml:space="preserve">— Chuẩn bị sổ đo, bút ghi chép, sơ đồ lưới và lịch đo đã lập cho các ca đo, v.v.</w:t>
+        <w:t xml:space="preserve">— Chuẩn bị sé do, bút ghi chép, sơ đồ lưới và lịch đo đã lập cho các ca đo, v.v.</w:t>
       </w:r>
     </w:p>
     <w:p>
@@ -8557,7 +8415,7 @@
           <w:sz w:val="26"/>
           <w:szCs w:val="26"/>
         </w:rPr>
-        <w:t xml:space="preserve">9.1.1 Sau khi đến trạm đo, phải đặt máy thu ổn định sau đó mới đặt ăng-ten (trường hợp máy thu và</w:t>
+        <w:t xml:space="preserve">9.1.1 Sau khi đến trạm đo, phải đặt máy thu dn định sau đó mới đặt ăng-ten (trường hợp máy thu và</w:t>
       </w:r>
     </w:p>
     <w:p>
@@ -8631,7 +8489,7 @@
           <w:sz w:val="26"/>
           <w:szCs w:val="26"/>
         </w:rPr>
-        <w:t xml:space="preserve">hướng cần đặt trước cọc định hướng, mỗi lần đo dựa vào cọc định hướng để định hướng ăng-ten.</w:t>
+        <w:t xml:space="preserve">hướng cần đặt trước cọc định hướng, mỗi lần đo dựa vào cọc định hướng dé định hướng ăng-ten.</w:t>
       </w:r>
     </w:p>
     <w:p>
@@ -8686,7 +8544,7 @@
           <w:sz w:val="26"/>
           <w:szCs w:val="26"/>
         </w:rPr>
-        <w:t xml:space="preserve">9.1.5 Máy thu GNSS phải cố định tâm quang hoc để đo lưới GNSS, định tâm quang học của máy thu</w:t>
+        <w:t xml:space="preserve">9.1.5 Máy thu GNSS phải cố định tâm quang hoc dé đo lưới GNSS, định tâm quang học của máy thu</w:t>
       </w:r>
     </w:p>
     <w:p>
@@ -8816,7 +8674,7 @@
           <w:sz w:val="26"/>
           <w:szCs w:val="26"/>
         </w:rPr>
-        <w:t xml:space="preserve">1 mm, ghi tên trạm máy, ngày tháng năm, số hiệu ca đo, chiều cao ăng-ten. Sau khi tắt máy, tiến hành đo lại chiều cao ăng-ten để kiểm tra, chênh lệch chiều cao ăng-ten giữa hai lần đo không được vượt quá + 2 mm đối với lưới khống chế mặt bằng phục vụ thi công và lưới quan trắc chuyển dịch ngang công trình, lấy giá trị trung bình ghi vào sổ đo. Nếu như chênh lệch vượt quá hạn sai cho phép, thì phải tim hiểu nguyên nhân, đề xuất ý kiến xử lý và ghi vào cột ghi chú trong sổ đo.</w:t>
+        <w:t xml:space="preserve">1 mm, ghi tên trạm máy, ngày tháng năm, số hiệu ca đo, chiều cao ăng-ten. Sau khi tắt máy, tiến hành đo lại chiều cao ăng-ten dé kiểm tra, chênh lệch chiều cao ăng-ten giữa hai lần đo không được vượt quá + 2 mm đối với lưới khống chế mặt bằng phục vụ thi công và lưới quan trắc chuyển dịch ngang công trình, lấy giá trị trung bình ghi vào sổ đo. Nếu như chênh lệch vượt quá hạn sai cho phép, thì phải tim hiểu nguyên nhân, đề xuất ý kiến xử lý và ghi vào cột ghi chú trong sé do.</w:t>
       </w:r>
     </w:p>
     <w:p>
@@ -9001,7 +8859,7 @@
           <w:sz w:val="26"/>
           <w:szCs w:val="26"/>
         </w:rPr>
-        <w:t xml:space="preserve">thu. Khi có sấm chớp, mưa to phải tắt máy, ngừng đo và thu cất ăng-ten để phòng sét đánh.</w:t>
+        <w:t xml:space="preserve">thu. Khi có sấm chớp, mưa to phải tắt máy, ngừng đo và thu cất ăng-ten dé phòng sét đánh.</w:t>
       </w:r>
     </w:p>
     <w:p>
@@ -9130,25 +8988,7 @@
           <w:sz w:val="18"/>
           <w:szCs w:val="18"/>
         </w:rPr>
-        <w:t xml:space="preserve">[Bảng số liệu OCR chưa dựng đủ lưới kẻ — vui lòng đối chiếu PDF gốc trang tương ứng. Đoạn văn xung quanh vẫn giữ nguyên.]</w:t>
-      </w:r>
-    </w:p>
-    <w:p>
-      <w:pPr>
-        <w:spacing w:after="80" w:before="0" w:line="360"/>
-        <w:jc w:val="both"/>
-      </w:pPr>
-      <w:r>
-        <w:rPr>
-          <w:rFonts w:ascii="Times New Roman" w:cs="Times New Roman" w:eastAsia="Times New Roman" w:hAnsi="Times New Roman"/>
-          <w:b w:val="false"/>
-          <w:bCs w:val="false"/>
-          <w:i/>
-          <w:iCs/>
-          <w:sz w:val="20"/>
-          <w:szCs w:val="20"/>
-        </w:rPr>
-        <w:t xml:space="preserve">(mạ |Mávhu2tns6tờ [Tih | 260 | 245 | 290 | 225 |</w:t>
+        <w:t xml:space="preserve">[Bảng số liệu OCR chưa dựng đủ lưới kẻ — vui lòng đối chiếu PDF gốc. Đoạn văn xung quanh vẫn giữ nguyên.]</w:t>
       </w:r>
     </w:p>
     <w:p>
@@ -9313,7 +9153,7 @@
           <w:sz w:val="18"/>
           <w:szCs w:val="18"/>
         </w:rPr>
-        <w:t xml:space="preserve">[Bảng số liệu OCR chưa dựng đủ lưới kẻ — vui lòng đối chiếu PDF gốc trang tương ứng. Đoạn văn xung quanh vẫn giữ nguyên.]</w:t>
+        <w:t xml:space="preserve">[Bảng số liệu OCR chưa dựng đủ lưới kẻ — vui lòng đối chiếu PDF gốc. Đoạn văn xung quanh vẫn giữ nguyên.]</w:t>
       </w:r>
     </w:p>
     <w:p>
@@ -9423,7 +9263,7 @@
           <w:sz w:val="26"/>
           <w:szCs w:val="26"/>
         </w:rPr>
-        <w:t xml:space="preserve">được đo đạc phải đảm bảo các yêu cầu quy định như quy định ở Bảng 8, thiết bị dùng để đo đạc là các máy GNSS nêu ở Bảng 5.</w:t>
+        <w:t xml:space="preserve">được đo đạc phải đảm bảo các yêu cầu quy định như quy định ở Bảng 8, thiết bị dùng dé đo đạc là các máy GNSS nêu ở Bảng 5.</w:t>
       </w:r>
     </w:p>
     <w:p>
@@ -9460,7 +9300,7 @@
           <w:sz w:val="18"/>
           <w:szCs w:val="18"/>
         </w:rPr>
-        <w:t xml:space="preserve">[Bảng số liệu OCR chưa dựng đủ lưới kẻ — vui lòng đối chiếu PDF gốc trang tương ứng. Đoạn văn xung quanh vẫn giữ nguyên.]</w:t>
+        <w:t xml:space="preserve">[Bảng số liệu OCR chưa dựng đủ lưới kẻ — vui lòng đối chiếu PDF gốc. Đoạn văn xung quanh vẫn giữ nguyên.]</w:t>
       </w:r>
     </w:p>
     <w:p>
@@ -9607,7 +9447,7 @@
           <w:sz w:val="26"/>
           <w:szCs w:val="26"/>
         </w:rPr>
-        <w:t xml:space="preserve">cơ sở cấp 1, lưới cơ sở cấp 2 trong lập lưới khảo sát công trình.</w:t>
+        <w:t xml:space="preserve">cơ sở cấp 1, lưới cơ sở cắp 2 trong lập lưới khảo sát công trình.</w:t>
       </w:r>
     </w:p>
     <w:p>
@@ -9682,7 +9522,7 @@
           <w:sz w:val="26"/>
           <w:szCs w:val="26"/>
         </w:rPr>
-        <w:t xml:space="preserve">10.1 Đo lưới đo vẽ cấp 2 trong thành lập lưới khảo sát công trình bằng kỹ thuật đo GNSS động xử lý sau</w:t>
+        <w:t xml:space="preserve">10.1 Đo lưới đo vẽ cắp 2 trong thành lập lưới khảo sát công trình bằng kỹ thuật đo GNSS động xử lý sau</w:t>
       </w:r>
     </w:p>
     <w:p>
@@ -9719,26 +9559,26 @@
           <w:sz w:val="26"/>
           <w:szCs w:val="26"/>
         </w:rPr>
-        <w:t xml:space="preserve">10.1.1 Khi đo lưới đo vẽ cấp 2 bằng kỹ thuật do GNSS động phải sử dụng thiết bị do các hãng chuyên</w:t>
-      </w:r>
-    </w:p>
-    <w:p>
-      <w:pPr>
-        <w:spacing w:after="100" w:before="0" w:line="360"/>
-        <w:ind w:firstLine="567"/>
-        <w:jc w:val="both"/>
-      </w:pPr>
-      <w:r>
-        <w:rPr>
-          <w:rFonts w:ascii="Times New Roman" w:cs="Times New Roman" w:eastAsia="Times New Roman" w:hAnsi="Times New Roman"/>
-          <w:b w:val="false"/>
-          <w:bCs w:val="false"/>
-          <w:i w:val="false"/>
-          <w:iCs w:val="false"/>
-          <w:sz w:val="26"/>
-          <w:szCs w:val="26"/>
-        </w:rPr>
-        <w:t xml:space="preserve">dụng ché tạo và được kiểm nghiệm thực tế ở Việt Nam. Bộ thiết bị đo bao gồm các máy thu tín hiệu vệ tinh GNSS loại thu được trị đo Code và trị đo Phase, 1 tan số hoặc da tần sé, có sai số đo cạnh nhỏ hơn hoặc bằng (10 mm + 1 ppm x D), D là chiều dài cạnh đo tính bằng kilômét (km) và các thiết bị điều khiển có chức năng đo GNSS động.</w:t>
+        <w:t xml:space="preserve">10.1.1 Khi đo lưới đo vẽ cắp 2 bằng kỹ thuật do GNSS động phải sử dụng thiết bị do các hãng chuyên</w:t>
+      </w:r>
+    </w:p>
+    <w:p>
+      <w:pPr>
+        <w:spacing w:after="100" w:before="0" w:line="360"/>
+        <w:ind w:firstLine="567"/>
+        <w:jc w:val="both"/>
+      </w:pPr>
+      <w:r>
+        <w:rPr>
+          <w:rFonts w:ascii="Times New Roman" w:cs="Times New Roman" w:eastAsia="Times New Roman" w:hAnsi="Times New Roman"/>
+          <w:b w:val="false"/>
+          <w:bCs w:val="false"/>
+          <w:i w:val="false"/>
+          <w:iCs w:val="false"/>
+          <w:sz w:val="26"/>
+          <w:szCs w:val="26"/>
+        </w:rPr>
+        <w:t xml:space="preserve">dụng ché tạo và được kiểm nghiệm thực tế ở Việt Nam. Bộ thiết bị đo bao gồm các máy thu tín hiệu vệ tinh GNSS loại thu được trị đo Code và trị do Phase, 1 tan số hoặc da tần sé, có sai số đo cạnh nhỏ hơn hoặc bằng (10 mm + 1 ppm x D), D là chiều dài cạnh đo tính bằng kilômét (km) và các thiết bị điều khiển có chức năng đo GNSS động.</w:t>
       </w:r>
     </w:p>
     <w:p>
@@ -9886,7 +9726,7 @@
           <w:sz w:val="26"/>
           <w:szCs w:val="26"/>
         </w:rPr>
-        <w:t xml:space="preserve">chưa có tọa độ nhưng có điều kiện thu tín hiệu vệ tỉnh tốt và phải đo trùng vào các điểm gốc trong khu đo để đảm bảo trạm đo có it nhất 3 điểm gốc thuộc lưới đo vẽ cấp 1 trở lên, phân bố đều ở các vị trí khống chế toàn bộ trạm đo để bình sai lưới (đối với đo động xử lý sau) và để quy chuẩn về hệ thống tọa độ địa phương (đối với đo động thời gian thực). Việc đo tại các điểm phải được tiến hành trong điều kiện được phép đo, theo ché độ đo điểm khống ché ít nhất 20 trị đo. Ang-ten tại trạm gốc và ăng-ten trạm động phải được định tâm có sai số nhỏ hơn hoặc bằng 5 mm, chiều cao ăng-ten xác định đến milimét.</w:t>
+        <w:t xml:space="preserve">chưa có tọa độ nhưng có điều kiện thu tín hiệu vệ tỉnh tốt và phải đo trùng vào các điểm gốc trong khu đo dé đảm bảo trạm đo có it nhất 3 điểm gốc thuộc lưới đo vẽ cấp 1 trở lên, phân bố đều ở các vị trí khống chế toàn bộ trạm đo để bình sai lưới (đối với đo động xử lý sau) và để quy chuẩn về hệ thống tọa độ địa phương (đối với đo động thời gian thực). Việc đo tại các điểm phải được tiến hành trong điều kiện được phép đo, theo ché độ đo điểm khống ché ít nhất 20 trị đo. Ang-ten tại trạm gốc và ăng-ten trạm động phải được định tâm có sai số nhỏ hơn hoặc bằng 5 mm, chiều cao ăng-ten xác định đến milimét.</w:t>
       </w:r>
     </w:p>
     <w:p>
@@ -9941,7 +9781,7 @@
           <w:sz w:val="26"/>
           <w:szCs w:val="26"/>
         </w:rPr>
-        <w:t xml:space="preserve">10.1.7 Khoảng cách lớn nhát từ trạm gốc đến điểm lưới đo vẽ cấp 2 không quá 5 km đối với đo vẽ bản đồ</w:t>
+        <w:t xml:space="preserve">10.1.7 Khoảng cách lớn nhát từ trạm gốc đến điểm lưới đo vẽ cắp 2 không quá 5 km đối với đo vẽ bản đồ</w:t>
       </w:r>
     </w:p>
     <w:p>
@@ -9997,7 +9837,7 @@
           <w:sz w:val="26"/>
           <w:szCs w:val="26"/>
         </w:rPr>
-        <w:t xml:space="preserve">động xử lý sau được xử lý, tính toán bình sai với các chỉ tiêu kỹ thuật như đối với lưới đo vẽ cấp 2 sử dụng kỹ thuật đo GNSS tĩnh. Kết quả đo lưới đo vẽ cấp 2 bằng kỹ thuật đo GNSS động thời gian thực được lập thành báo cáo trong đó bao gồm danh mục điểm, các thông số chính của trạm đo: điểm trạm gốc, các điểm quy chuẩn, sai số tại các điểm quy chuẩn phục vụ cho việc lập báo cáo kỹ thuật.</w:t>
+        <w:t xml:space="preserve">động xử lý sau được xử lý, tính toán bình sai với các chỉ tiêu kỹ thuật như đối với lưới đo vẽ cấp 2 sử dụng kỹ thuật đo GNSS tĩnh. Kết quả đo lưới đo vẽ cắp 2 bằng kỹ thuật đo GNSS động thời gian thực được lập thành báo cáo trong đó bao gồm danh mục điểm, các thông số chính của trạm đo: điểm trạm gốc, các điểm quy chuẩn, sai số tại các điểm quy chuẩn phục vụ cho việc lập báo cáo kỹ thuật.</w:t>
       </w:r>
     </w:p>
     <w:p>
@@ -10295,26 +10135,26 @@
           <w:sz w:val="18"/>
           <w:szCs w:val="18"/>
         </w:rPr>
-        <w:t xml:space="preserve">[Bảng số liệu OCR chưa dựng đủ lưới kẻ — vui lòng đối chiếu PDF gốc trang tương ứng. Đoạn văn xung quanh vẫn giữ nguyên.]</w:t>
-      </w:r>
-    </w:p>
-    <w:p>
-      <w:pPr>
-        <w:spacing w:after="100" w:before="0" w:line="360"/>
-        <w:ind w:firstLine="567"/>
-        <w:jc w:val="both"/>
-      </w:pPr>
-      <w:r>
-        <w:rPr>
-          <w:rFonts w:ascii="Times New Roman" w:cs="Times New Roman" w:eastAsia="Times New Roman" w:hAnsi="Times New Roman"/>
-          <w:b w:val="false"/>
-          <w:bCs w:val="false"/>
-          <w:i w:val="false"/>
-          <w:iCs w:val="false"/>
-          <w:sz w:val="26"/>
-          <w:szCs w:val="26"/>
-        </w:rPr>
-        <w:t xml:space="preserve">Các ký hiệu trong Bảng 9: k là khoảng cách giữa các trạm định vị vệ tinh tham gia xử lý trong mạng lưới đễ cung cấp dịch vụ đo động thời gian thực;</w:t>
+        <w:t xml:space="preserve">[Bảng số liệu OCR chưa dựng đủ lưới kẻ — vui lòng đối chiếu PDF gốc. Đoạn văn xung quanh vẫn giữ nguyên.]</w:t>
+      </w:r>
+    </w:p>
+    <w:p>
+      <w:pPr>
+        <w:spacing w:after="100" w:before="0" w:line="360"/>
+        <w:ind w:firstLine="567"/>
+        <w:jc w:val="both"/>
+      </w:pPr>
+      <w:r>
+        <w:rPr>
+          <w:rFonts w:ascii="Times New Roman" w:cs="Times New Roman" w:eastAsia="Times New Roman" w:hAnsi="Times New Roman"/>
+          <w:b w:val="false"/>
+          <w:bCs w:val="false"/>
+          <w:i w:val="false"/>
+          <w:iCs w:val="false"/>
+          <w:sz w:val="26"/>
+          <w:szCs w:val="26"/>
+        </w:rPr>
+        <w:t xml:space="preserve">Các ký hiệu trong Bảng 9: k là khoảng cách giữa các trạm định vị vệ tinh tham gia xử lý trong mạng lưới đễ cung cắp dịch vụ đo động thời gian thực;</w:t>
       </w:r>
     </w:p>
     <w:p>
@@ -11030,7 +10870,7 @@
           <w:sz w:val="18"/>
           <w:szCs w:val="18"/>
         </w:rPr>
-        <w:t xml:space="preserve">[Bảng số liệu OCR chưa dựng đủ lưới kẻ — vui lòng đối chiếu PDF gốc trang tương ứng. Đoạn văn xung quanh vẫn giữ nguyên.]</w:t>
+        <w:t xml:space="preserve">[Bảng số liệu OCR chưa dựng đủ lưới kẻ — vui lòng đối chiếu PDF gốc. Đoạn văn xung quanh vẫn giữ nguyên.]</w:t>
       </w:r>
     </w:p>
     <w:p>
@@ -11105,7 +10945,7 @@
           <w:sz w:val="26"/>
           <w:szCs w:val="26"/>
         </w:rPr>
-        <w:t xml:space="preserve">đều phải chọn các cạnh độc lập tạo thành các vòng đo độc lập; sai số khép tương đối tọa độ thành phần và sai số khép tương đối chiều dài của các vòng đo độc lập phải phù hợp với các quy định sau đây: @,&lt; 2Vn-o a, S$ 2Nn-o @) œ;&lt; 2Ín-ø ø &lt; 2jần-ơ trong đó: ơ_ là độ chính xác chiều dài: ø = fa?+(b-10* - D)? ; @ là sai số khép vòng đo: » = jo + +a% ; n là sỗ cạnh trong vòng đo độc lập.</w:t>
+        <w:t xml:space="preserve">đều phải chọn các cạnh độc lập tạo thành các vòng đo độc lập; sai số khép tương đối tọa độ thành phần và sai số khép tương đối chiều dài của các vòng đo độc lập phải phù hợp với các quy định sau đây: @,&lt; 2Vn-o a, S$ 2Nn-o @) œ;&lt; 2Ín-ø ø &lt; 2jần-ơ trong đó: ơ_ là độ chính xác chiều dài: ø = fa?+(b-10* - D)?; @ là sai số khép vòng đo: » = jo + +a%; n là sỗ cạnh trong vòng đo độc lập.</w:t>
       </w:r>
     </w:p>
     <w:p>
@@ -11271,7 +11111,7 @@
           <w:sz w:val="26"/>
           <w:szCs w:val="26"/>
         </w:rPr>
-        <w:t xml:space="preserve">không thế bảo đảm han sai quy định thì có thể dựa vào yêu cầu kỹ thuật chọn thêm điểm mới để tiến hành đo lại.</w:t>
+        <w:t xml:space="preserve">không thé bảo đảm han sai quy định thì có thể dựa vào yêu cầu kỹ thuật chọn thêm điểm mới để tiến hành đo lại.</w:t>
       </w:r>
     </w:p>
     <w:p>
@@ -11344,7 +11184,7 @@
           <w:sz w:val="26"/>
           <w:szCs w:val="26"/>
         </w:rPr>
-        <w:t xml:space="preserve">12.4.2 Có thế sử dụng tất cả các cạnh đo ké cả các cạnh phụ thuộc để bình sai lưới néu khẳng định tất cả</w:t>
+        <w:t xml:space="preserve">12.4.2 Có thé sử dụng tất cả các cạnh đo ké cả các cạnh phụ thuộc để bình sai lưới néu khẳng định tất cả</w:t>
       </w:r>
     </w:p>
     <w:p>
@@ -11457,7 +11297,7 @@
           <w:sz w:val="26"/>
           <w:szCs w:val="26"/>
         </w:rPr>
-        <w:t xml:space="preserve">V,, &lt; 3ơ Khi vượt hạn sai có thể thấy rằng véc-tơ cạnh áy hoặc lân cận có chứa sai số thô, cần phải dùng phương pháp đã có trong phần mềm hoặc phương pháp tự đưa ra để loại trừ véc-tơ cạnh có chứa sai số thô cho đến khi thoả mãn yêu cầu trên.</w:t>
+        <w:t xml:space="preserve">V,, &lt; 3ơ Khi vượt hạn sai có thể thấy rằng véc-tơ cạnh áy hoặc lân cận có chứa sai số thô, cần phải dùng phương pháp đã có trong phần mềm hoặc phương pháp tự đưa ra dé loại trừ véc-tơ cạnh có chứa sai số thô cho đến khi thoả mãn yêu cầu trên.</w:t>
       </w:r>
     </w:p>
     <w:p>
@@ -11813,7 +11653,7 @@
           <w:sz w:val="26"/>
           <w:szCs w:val="26"/>
         </w:rPr>
-        <w:t xml:space="preserve">— Sai số khép hình và sai số khép hình yếu nhat; .</w:t>
+        <w:t xml:space="preserve">— Sai số khép hình và sai số khép hình yếu nhat;.</w:t>
       </w:r>
     </w:p>
     <w:p>
@@ -11851,7 +11691,7 @@
           <w:sz w:val="26"/>
           <w:szCs w:val="26"/>
         </w:rPr>
-        <w:t xml:space="preserve">— tọa độ vuông góc không gian XYZ;</w:t>
+        <w:t xml:space="preserve">— Toa độ vuông góc không gian XYZ;</w:t>
       </w:r>
     </w:p>
     <w:p>
@@ -11870,7 +11710,7 @@
           <w:sz w:val="26"/>
           <w:szCs w:val="26"/>
         </w:rPr>
-        <w:t xml:space="preserve">— tọa độ và độ cao trắc địa B, L, H;</w:t>
+        <w:t xml:space="preserve">— Toa độ và độ cao trắc địa B, L, H;</w:t>
       </w:r>
     </w:p>
     <w:p>
@@ -11889,7 +11729,7 @@
           <w:sz w:val="26"/>
           <w:szCs w:val="26"/>
         </w:rPr>
-        <w:t xml:space="preserve">— tọa độ vuông góc phẳng và độ cao sau bình sai;</w:t>
+        <w:t xml:space="preserve">— Toa độ vuông góc phẳng và độ cao sau bình sai;</w:t>
       </w:r>
     </w:p>
     <w:p>
@@ -11964,26 +11804,26 @@
           <w:sz w:val="26"/>
           <w:szCs w:val="26"/>
         </w:rPr>
-        <w:t xml:space="preserve">— tọa độ các điểm lưới GNSS sau bình sai chuyển về hệ tọa độ của công trình theo phương pháp định</w:t>
-      </w:r>
-    </w:p>
-    <w:p>
-      <w:pPr>
-        <w:spacing w:after="100" w:before="0" w:line="360"/>
-        <w:ind w:firstLine="567"/>
-        <w:jc w:val="both"/>
-      </w:pPr>
-      <w:r>
-        <w:rPr>
-          <w:rFonts w:ascii="Times New Roman" w:cs="Times New Roman" w:eastAsia="Times New Roman" w:hAnsi="Times New Roman"/>
-          <w:b w:val="false"/>
-          <w:bCs w:val="false"/>
-          <w:i w:val="false"/>
-          <w:iCs w:val="false"/>
-          <w:sz w:val="26"/>
-          <w:szCs w:val="26"/>
-        </w:rPr>
-        <w:t xml:space="preserve">vị tối ưu, có thế sử dụng công thức chuyển đổi tọa độ phẳng bón tham số có dạng: X, =X, +m-x, cosg—m-y, sing 7) Ÿ; = Yạ +m- ÿ,COSø+ m: X, sing</w:t>
+        <w:t xml:space="preserve">— Toa độ các điểm lưới GNSS sau bình sai chuyển về hệ tọa độ của công trình theo phương pháp định</w:t>
+      </w:r>
+    </w:p>
+    <w:p>
+      <w:pPr>
+        <w:spacing w:after="100" w:before="0" w:line="360"/>
+        <w:ind w:firstLine="567"/>
+        <w:jc w:val="both"/>
+      </w:pPr>
+      <w:r>
+        <w:rPr>
+          <w:rFonts w:ascii="Times New Roman" w:cs="Times New Roman" w:eastAsia="Times New Roman" w:hAnsi="Times New Roman"/>
+          <w:b w:val="false"/>
+          <w:bCs w:val="false"/>
+          <w:i w:val="false"/>
+          <w:iCs w:val="false"/>
+          <w:sz w:val="26"/>
+          <w:szCs w:val="26"/>
+        </w:rPr>
+        <w:t xml:space="preserve">vị tối ưu, có thé sử dụng công thức chuyển đổi tọa độ phẳng bón tham số có dạng: X, =X, +m-x, cosg—m-y, sing 7) Ÿ; = Yạ +m- ÿ,COSø+ m: X, sing</w:t>
       </w:r>
     </w:p>
     <w:p>
@@ -12703,7 +12543,7 @@
           <w:sz w:val="26"/>
           <w:szCs w:val="26"/>
         </w:rPr>
-        <w:t xml:space="preserve">Kích thước tính bằng milimét Ø16 ⁄/ yy 4 o 7 | 400 | 600 Hình A.3 — Cấu tạo mốc GNSS cấp 1, cấp 2 Kích thước tính bằng milimét</w:t>
+        <w:t xml:space="preserve">Kích thước tính bằng milimét Ø16 ⁄/ yy 4 o 7 600 Hình A.3 — Cấu tạo mốc GNSS cấp 1, cấp 2 Kích thước tính bằng milimét</w:t>
       </w:r>
     </w:p>
     <w:p>
@@ -12760,7 +12600,7 @@
           <w:sz w:val="26"/>
           <w:szCs w:val="26"/>
         </w:rPr>
-        <w:t xml:space="preserve">Kích thước tính bằng milimét 1 400 230 aif CD 2 rT; : a | 5 : 55_110_55 : FPT 58 140 55 ° ` E3% ; ai : : Y 1000 CHÚ DĂN:</w:t>
+        <w:t xml:space="preserve">Kích thước tính bằng milimét 1 400 230 aif CD 2 rT;: a | 5: 55_110_55: FPT 58 140 55 ° ` E3%; ai:: Y 1000 CHÚ DĂN:</w:t>
       </w:r>
     </w:p>
     <w:p>
@@ -12934,7 +12774,7 @@
           <w:sz w:val="18"/>
           <w:szCs w:val="18"/>
         </w:rPr>
-        <w:t xml:space="preserve">[Bảng số liệu OCR chưa dựng đủ lưới kẻ — vui lòng đối chiếu PDF gốc trang tương ứng. Đoạn văn xung quanh vẫn giữ nguyên.]</w:t>
+        <w:t xml:space="preserve">[Bảng số liệu OCR chưa dựng đủ lưới kẻ — vui lòng đối chiếu PDF gốc. Đoạn văn xung quanh vẫn giữ nguyên.]</w:t>
       </w:r>
     </w:p>
     <w:p>
@@ -12971,7 +12811,7 @@
           <w:sz w:val="18"/>
           <w:szCs w:val="18"/>
         </w:rPr>
-        <w:t xml:space="preserve">[Bảng số liệu OCR chưa dựng đủ lưới kẻ — vui lòng đối chiếu PDF gốc trang tương ứng. Đoạn văn xung quanh vẫn giữ nguyên.]</w:t>
+        <w:t xml:space="preserve">[Bảng số liệu OCR chưa dựng đủ lưới kẻ — vui lòng đối chiếu PDF gốc. Đoạn văn xung quanh vẫn giữ nguyên.]</w:t>
       </w:r>
     </w:p>
     <w:p>
@@ -13010,7 +12850,7 @@
           <w:sz w:val="26"/>
           <w:szCs w:val="26"/>
         </w:rPr>
-        <w:t xml:space="preserve">(tham khảo) Mẫu bảng thống kê số liệu đo GNSS MAU BANG THONG KE SÓ LIEU ĐO Khu GO? … điểm/ Tên trạm đo Bắt đầu Kết máy thu | ten (part cao | pháp do number) (m) cao ăng-ten 1. GPS-01 97723255 | 21-11- | 14h00m | 15h04m | Trimble Zephyr 1.510 Đo 2019 5700 | Geodetic nghiéng đến mép dưới 2. GPS-02 |76303251| 21-11- | 14h08m | 16h41m | Trimble P/N Đo đến đáy ăng-ten (ARP) 2019 5700 4. Il-1 76303261 | 22-11- | 07h33m | 08h04m | Trimble | Zephyr | 1.486 NI a ed 5. Il-2 97723262| 22-11- | 07h34m | 08h05m | Trimble | Compact | 1.550 2019 4000 L1/L2 SSE 6. II-3 76233260 | 22-11- | 07h31m | 09h07m | Trimble P/N 1.499 NI ee 2019 5700 97723263 | 22-11- | 08h26m | 09h06m | Trimble | Zephyr | 1.530</w:t>
+        <w:t xml:space="preserve">(tham khảo) Mẫu bảng thống kê số liệu đo GNSS MAU BANG THONG KE SÓ LIEU ĐO Khu GO? … number) (m) cao ăng-ten 2019 5700 | Geodetic nghiéng đến mép dưới đến đáy ăng-ten (ARP) 2019 5700 NI a ed 2019 4000 L1/L2 SSE NI ee 2019 5700</w:t>
       </w:r>
     </w:p>
     <w:p>
@@ -13068,7 +12908,7 @@
           <w:sz w:val="26"/>
           <w:szCs w:val="26"/>
         </w:rPr>
-        <w:t xml:space="preserve">D.2.1 Chọn nơi có góc cao của vệ tinh lớn hơn 15°, không có vat che khuất để đặt ăng-ten. Ndi giữa ăng-ten và máy chia công xuất như Hình D.1. D.2.2 Nối điện hai máy thu ở hai đầu chiều dài chuẩn, cùng thu tín hiệu của bốn vệ tinh trở lên trong vòng 1h đến 1,5 h. D.2.3 Đổi vị trí, nối điện từ máy chia công suất đến máy thu, đo một lần nữa. D.2.4 Dùng phần mềm chuyên dùng tính ra tọa độ, chiều dài của cạnh chuẩn, số chênh phải nhỏ hơn mm nếu lớn hơn đưa về xưởng sửa chữa hoặc hạ cấp dùng.</w:t>
+        <w:t xml:space="preserve">D.2.1 Chọn nơi có góc cao của vệ tinh lớn hơn 15°, không có vat che khuất dé đặt ăng-ten. Ndi giữa ăng-ten và máy chia công xuất như Hình D.1. D.2.2 Nối điện hai máy thu ở hai đầu chiều dài chuẩn, cùng thu tín hiệu của bốn vệ tinh trở lên trong vòng 1h đến 1,5 h. D.2.3 Đổi vị trí, nối điện từ máy chia công suất đến máy thu, đo một lần nữa. D.2.4 Dùng phần mềm chuyên dùng tính ra tọa độ, chiều dài của cạnh chuẩn, số chênh phải nhỏ hơn mm nếu lớn hơn đưa về xưởng sửa chữa hoặc hạ cấp dùng.</w:t>
       </w:r>
     </w:p>
     <w:p>
@@ -13262,7 +13102,7 @@
           <w:sz w:val="26"/>
           <w:szCs w:val="26"/>
         </w:rPr>
-        <w:t xml:space="preserve">(tham khảo) Kết quả đo thực nghiệm và xử lý số liệu lưới đo vẽ cấp 1 trong khảo sát công trình bằng công nghệ GNSS tĩnh H.1 Sơ đồ mạng lưới đo GNSS IV-1 S957 GPS-01 ZO GPS-02 IV-2 | 0 GPS-03 lÑ MÃ | Z GPS-04 IV-3 IV-4 Hình H.1 - Sơ đồ mạng lưới đo GNSS.</w:t>
+        <w:t xml:space="preserve">(tham khảo) Kết quả đo thực nghiệm và xử lý số liệu lưới đo vẽ cấp 1 trong khảo sát công trình bằng công nghệ GNSS tĩnh H.1 Sơ đồ mạng lưới đo GNSS IV-1 S957 GPS-01 ZO GPS-02 IV-2 GPS-03 lÑ MÃ IV-3 IV-4 Hình H.1 - Sơ đồ mạng lưới đo GNSS.</w:t>
       </w:r>
     </w:p>
     <w:p>
@@ -13318,7 +13158,7 @@
           <w:sz w:val="18"/>
           <w:szCs w:val="18"/>
         </w:rPr>
-        <w:t xml:space="preserve">[Bảng số liệu OCR chưa dựng đủ lưới kẻ — vui lòng đối chiếu PDF gốc trang tương ứng. Đoạn văn xung quanh vẫn giữ nguyên.]</w:t>
+        <w:t xml:space="preserve">[Bảng số liệu OCR chưa dựng đủ lưới kẻ — vui lòng đối chiếu PDF gốc. Đoạn văn xung quanh vẫn giữ nguyên.]</w:t>
       </w:r>
     </w:p>
     <w:p>
@@ -13357,25 +13197,6 @@
           <w:szCs w:val="28"/>
         </w:rPr>
         <w:t xml:space="preserve">1782 Jcrsos] M+| -131,065 -56,272 39,702 | 0,009 3,037</w:t>
-      </w:r>
-    </w:p>
-    <w:p>
-      <w:pPr>
-        <w:spacing w:after="100" w:before="0" w:line="360"/>
-        <w:ind w:firstLine="567"/>
-        <w:jc w:val="both"/>
-      </w:pPr>
-      <w:r>
-        <w:rPr>
-          <w:rFonts w:ascii="Times New Roman" w:cs="Times New Roman" w:eastAsia="Times New Roman" w:hAnsi="Times New Roman"/>
-          <w:b w:val="false"/>
-          <w:bCs w:val="false"/>
-          <w:i w:val="false"/>
-          <w:iCs w:val="false"/>
-          <w:sz w:val="26"/>
-          <w:szCs w:val="26"/>
-        </w:rPr>
-        <w:t xml:space="preserve">Am 1782 |GPS-06 GPS-01 151,062 87,232 -99,981 | 0,008 2,755</w:t>
       </w:r>
     </w:p>
     <w:p>
@@ -13412,26 +13233,26 @@
           <w:sz w:val="18"/>
           <w:szCs w:val="18"/>
         </w:rPr>
-        <w:t xml:space="preserve">[Bảng số liệu OCR chưa dựng đủ lưới kẻ — vui lòng đối chiếu PDF gốc trang tương ứng. Đoạn văn xung quanh vẫn giữ nguyên.]</w:t>
-      </w:r>
-    </w:p>
-    <w:p>
-      <w:pPr>
-        <w:spacing w:after="100" w:before="0" w:line="360"/>
-        <w:ind w:firstLine="567"/>
-        <w:jc w:val="both"/>
-      </w:pPr>
-      <w:r>
-        <w:rPr>
-          <w:rFonts w:ascii="Times New Roman" w:cs="Times New Roman" w:eastAsia="Times New Roman" w:hAnsi="Times New Roman"/>
-          <w:b w:val="false"/>
-          <w:bCs w:val="false"/>
-          <w:i w:val="false"/>
-          <w:iCs w:val="false"/>
-          <w:sz w:val="26"/>
-          <w:szCs w:val="26"/>
-        </w:rPr>
-        <w:t xml:space="preserve">Các ký hiệu trong Bảng H.2: . ICHU THICH:</w:t>
+        <w:t xml:space="preserve">[Bảng số liệu OCR chưa dựng đủ lưới kẻ — vui lòng đối chiếu PDF gốc. Đoạn văn xung quanh vẫn giữ nguyên.]</w:t>
+      </w:r>
+    </w:p>
+    <w:p>
+      <w:pPr>
+        <w:spacing w:after="100" w:before="0" w:line="360"/>
+        <w:ind w:firstLine="567"/>
+        <w:jc w:val="both"/>
+      </w:pPr>
+      <w:r>
+        <w:rPr>
+          <w:rFonts w:ascii="Times New Roman" w:cs="Times New Roman" w:eastAsia="Times New Roman" w:hAnsi="Times New Roman"/>
+          <w:b w:val="false"/>
+          <w:bCs w:val="false"/>
+          <w:i w:val="false"/>
+          <w:iCs w:val="false"/>
+          <w:sz w:val="26"/>
+          <w:szCs w:val="26"/>
+        </w:rPr>
+        <w:t xml:space="preserve">Các ký hiệu trong Bảng H.2:. ICHU THICH:</w:t>
       </w:r>
     </w:p>
     <w:p>
@@ -13544,7 +13365,7 @@
           <w:sz w:val="18"/>
           <w:szCs w:val="18"/>
         </w:rPr>
-        <w:t xml:space="preserve">[Bảng số liệu OCR chưa dựng đủ lưới kẻ — vui lòng đối chiếu PDF gốc trang tương ứng. Đoạn văn xung quanh vẫn giữ nguyên.]</w:t>
+        <w:t xml:space="preserve">[Bảng số liệu OCR chưa dựng đủ lưới kẻ — vui lòng đối chiếu PDF gốc. Đoạn văn xung quanh vẫn giữ nguyên.]</w:t>
       </w:r>
     </w:p>
     <w:p>
@@ -13581,7 +13402,7 @@
           <w:sz w:val="18"/>
           <w:szCs w:val="18"/>
         </w:rPr>
-        <w:t xml:space="preserve">[Bảng số liệu OCR chưa dựng đủ lưới kẻ — vui lòng đối chiếu PDF gốc trang tương ứng. Đoạn văn xung quanh vẫn giữ nguyên.]</w:t>
+        <w:t xml:space="preserve">[Bảng số liệu OCR chưa dựng đủ lưới kẻ — vui lòng đối chiếu PDF gốc. Đoạn văn xung quanh vẫn giữ nguyên.]</w:t>
       </w:r>
     </w:p>
     <w:p>
@@ -13618,7 +13439,7 @@
           <w:sz w:val="18"/>
           <w:szCs w:val="18"/>
         </w:rPr>
-        <w:t xml:space="preserve">[Bảng số liệu OCR chưa dựng đủ lưới kẻ — vui lòng đối chiếu PDF gốc trang tương ứng. Đoạn văn xung quanh vẫn giữ nguyên.]</w:t>
+        <w:t xml:space="preserve">[Bảng số liệu OCR chưa dựng đủ lưới kẻ — vui lòng đối chiếu PDF gốc. Đoạn văn xung quanh vẫn giữ nguyên.]</w:t>
       </w:r>
     </w:p>
     <w:p>
@@ -13673,7 +13494,7 @@
           <w:sz w:val="18"/>
           <w:szCs w:val="18"/>
         </w:rPr>
-        <w:t xml:space="preserve">[Bảng số liệu OCR chưa dựng đủ lưới kẻ — vui lòng đối chiếu PDF gốc trang tương ứng. Đoạn văn xung quanh vẫn giữ nguyên.]</w:t>
+        <w:t xml:space="preserve">[Bảng số liệu OCR chưa dựng đủ lưới kẻ — vui lòng đối chiếu PDF gốc. Đoạn văn xung quanh vẫn giữ nguyên.]</w:t>
       </w:r>
     </w:p>
     <w:p>
@@ -13710,7 +13531,7 @@
           <w:sz w:val="18"/>
           <w:szCs w:val="18"/>
         </w:rPr>
-        <w:t xml:space="preserve">[Bảng số liệu OCR chưa dựng đủ lưới kẻ — vui lòng đối chiếu PDF gốc trang tương ứng. Đoạn văn xung quanh vẫn giữ nguyên.]</w:t>
+        <w:t xml:space="preserve">[Bảng số liệu OCR chưa dựng đủ lưới kẻ — vui lòng đối chiếu PDF gốc. Đoạn văn xung quanh vẫn giữ nguyên.]</w:t>
       </w:r>
     </w:p>
     <w:p>
@@ -13747,7 +13568,7 @@
           <w:sz w:val="18"/>
           <w:szCs w:val="18"/>
         </w:rPr>
-        <w:t xml:space="preserve">[Bảng số liệu OCR chưa dựng đủ lưới kẻ — vui lòng đối chiếu PDF gốc trang tương ứng. Đoạn văn xung quanh vẫn giữ nguyên.]</w:t>
+        <w:t xml:space="preserve">[Bảng số liệu OCR chưa dựng đủ lưới kẻ — vui lòng đối chiếu PDF gốc. Đoạn văn xung quanh vẫn giữ nguyên.]</w:t>
       </w:r>
     </w:p>
     <w:p>
@@ -13784,7 +13605,7 @@
           <w:sz w:val="18"/>
           <w:szCs w:val="18"/>
         </w:rPr>
-        <w:t xml:space="preserve">[Bảng số liệu OCR chưa dựng đủ lưới kẻ — vui lòng đối chiếu PDF gốc trang tương ứng. Đoạn văn xung quanh vẫn giữ nguyên.]</w:t>
+        <w:t xml:space="preserve">[Bảng số liệu OCR chưa dựng đủ lưới kẻ — vui lòng đối chiếu PDF gốc. Đoạn văn xung quanh vẫn giữ nguyên.]</w:t>
       </w:r>
     </w:p>
     <w:p>
@@ -13821,7 +13642,7 @@
           <w:sz w:val="18"/>
           <w:szCs w:val="18"/>
         </w:rPr>
-        <w:t xml:space="preserve">[Bảng số liệu OCR chưa dựng đủ lưới kẻ — vui lòng đối chiếu PDF gốc trang tương ứng. Đoạn văn xung quanh vẫn giữ nguyên.]</w:t>
+        <w:t xml:space="preserve">[Bảng số liệu OCR chưa dựng đủ lưới kẻ — vui lòng đối chiếu PDF gốc. Đoạn văn xung quanh vẫn giữ nguyên.]</w:t>
       </w:r>
     </w:p>
     <w:p>
@@ -14158,7 +13979,7 @@
           <w:sz w:val="26"/>
           <w:szCs w:val="26"/>
         </w:rPr>
-        <w:t xml:space="preserve">Tiêu chuẩn nêu trên được cụ thể hóa bằng biểu thức: q&lt; t-m, (1.2) trong đó: q, _ là giá trị chênh lệch tọa độ ở chu ky đang xét so với chu ky đầu; ím,, tà sai số trung phương xác định q, ; t là hệ số xác định tiêu chuẩn sai số giới hạn (f = 2). Việc đánh giá độ én định của các điểm mốc cơ sở được dựa trên công thức (1.2). Tuy nhiên đối với các mạng lưới trắc địa, do cấu trúc đồ hình mà sau khí bình sai giá trị sai số vị trí của các điểm (mp) thường có giá trị khác nhau, dẫn đến sai số xác định chuyển dịch (mạ) cũng khác nhau. Do vậy, có thể dựa vào sai số trung phương cần thiết để xác định chuyển dịch ngang đối với các điểm khống chế cơ sở (™,_ ) để làm tiêu chuẩn thống nhất chung cho toàn mạng lưới, khi đó tiêu chuẩn (I.2) được viết lại là: q, $2m,, (1.3) Khi xây dựng lưới một cấp thì: ng M,., 2 Không thể triển khai tính toán đồng thời với 2 biểu thức (1.1) va (1.3) do giữa 2 công thức đó có mối rang buộc về điều kiện áp dụng. Giải pháp hợp lý trong trường hợp này là áp dụng phương pháp lặp nhích dần.</w:t>
+        <w:t xml:space="preserve">Tiêu chuẩn nêu trên được cụ thể hóa bằng biểu thức: q&lt; t-m, (1.2) trong đó: q, _ là giá trị chênh lệch tọa độ ở chu ky đang xét so với chu ky đầu; ím,, tà sai số trung phương xác định q,; t là hệ số xác định tiêu chuẩn sai số giới hạn (f = 2). Việc đánh giá độ én định của các điểm mốc cơ sở được dựa trên công thức (1.2). Tuy nhiên đối với các mạng lưới trắc địa, do cấu trúc đồ hình mà sau khí bình sai giá trị sai số vị trí của các điểm (mp) thường có giá trị khác nhau, dẫn đến sai số xác định chuyển dịch (mạ) cũng khác nhau. Do vậy, có thể dựa vào sai số trung phương cần thiết để xác định chuyển dịch ngang đối với các điểm khống chế cơ sở (™,_ ) để làm tiêu chuẩn thống nhất chung cho toàn mạng lưới, khi đó tiêu chuẩn (I.2) được viết lại là: q, $2m,, (1.3) Khi xây dựng lưới một cấp thì: ng M,., 2 Không thể triển khai tính toán đồng thời với 2 biểu thức (1.1) va (1.3) do giữa 2 công thức đó có mối rang buộc về điều kiện áp dụng. Giải pháp hợp lý trong trường hợp này là áp dụng phương pháp lặp nhích dần.</w:t>
       </w:r>
     </w:p>
     <w:p>
@@ -14195,26 +14016,26 @@
           <w:sz w:val="26"/>
           <w:szCs w:val="26"/>
         </w:rPr>
-        <w:t xml:space="preserve">Khi bình sai lưới GNSS trong mỗi chu kỳ quan trắc cần chọn xử lý ở ché độ FIX tọa độ 1 điểm (coi lưới GNSS là lưới tự do bậc 0) để tránh ảnh hưởng của sai số số liệu gốc, sau đó cần định vị lại mạng lưới ở chu kỳ đang xét về vị trí trung bình của các điểm khống ché.én định. Quá trình định vị lại này được thực hiện thông qua việc áp dụng công thức chuyển đổi tọa độ: : X®) =X —B(CTB)'C75X (L4) trong đó: ðX là véc-tơ chuyển dịch của các điểm cơ sở trong chu kỷ khảo sát so với chu kỷ đầu (chu kỳ 0); Xf? là véc-tơ tọa độ bình sai lưới ở chu kỳ đang xét ứng với chế độ FIX 1 điểm gốc; X®) là véc-tơ tọa độ bình sai của lưới đó ứng với ma trận định vị C. Đối với lưới GNSS tự do ma trận B có dạng: 10 a-[ i= (1.5) Từ đó thu được biểu thức tính chuyển tọa độ bình sai giữa các phương án chon điều kiện định vị khác nhau như sau:</w:t>
-      </w:r>
-    </w:p>
-    <w:p>
-      <w:pPr>
-        <w:spacing w:after="100" w:before="0" w:line="360"/>
-        <w:ind w:firstLine="567"/>
-        <w:jc w:val="both"/>
-      </w:pPr>
-      <w:r>
-        <w:rPr>
-          <w:rFonts w:ascii="Times New Roman" w:cs="Times New Roman" w:eastAsia="Times New Roman" w:hAnsi="Times New Roman"/>
-          <w:b w:val="false"/>
-          <w:bCs w:val="false"/>
-          <w:i w:val="false"/>
-          <w:iCs w:val="false"/>
-          <w:sz w:val="26"/>
-          <w:szCs w:val="26"/>
-        </w:rPr>
-        <w:t xml:space="preserve">1- Tính chuyển tọa độ của các điểm trong lưới (gồm n điểm cơ sở) từ chế độ FIX 1 điểm gốc về lưới tự do với C = B: (8) 6 yp? = yj - [ey] n 2- Khi cần bớt đi 1 điểm định vị (ký hiệu là điểm £) trong tập hợp K điểm định vi: k YX prety xP) = x! a : có (7) : ' YY mm. y?=y)- a Trong trường hợp việc định vị lưới được thực hiện dựa trên công thức (1.1), néu tla điểm không ổn định và cần phải loại bỏ khỏi quá trình định vị lưới (bằng cách gán cho điểm đó giá tri C = 0) thì tọa độ các điểm trong lưới sẽ được tính theo công thức: yl) = y(t) } 5x, K-1 by (1.8) (2) 5 Ve sili? 4 K-1 Xét đặc điểm của việc tính toán xử lý số liệu lưới GNSS và trên cơ sở các công thức chuyển đổi tọa độ trong mạng lưới như ở trên, thực hiện một quy trình phân tích độ ổn định lưới GNSS cơ sở trong quan trắc chuyển dịch ngang công trình theo phương pháp lặp nhích dần như sau: Bước 1: Trong chu kỳ đang khảo sát, thực hiện bình sai lưới khống chế cơ sở như mạng lưới tự do với 1 điểm FIX tọa độ. Bước 2: Tính chuyển tọa độ bình sai của các điểm trong mạng lưới về hệ tọa độ mới với điều kiện định vị C = B (công thức I.1). Bước 3: Tính độ lệch tọa độ của tất cảc các điểm trong lưới so với tọa độ các điểm đó ở chu kỳ đầu và áp dụng tiêu chuẩn (1.3) để kiểm tra, đánh giá độ ổn định của các điểm mốc có C = B trong lưới. Bước 4: Có thế xảy ra một trong hai kha năng:</w:t>
+        <w:t xml:space="preserve">Khi bình sai lưới GNSS trong mỗi chu kỳ quan trắc cần chọn xử lý ở ché độ FIX tọa độ 1 điểm (coi lưới GNSS là lưới tự do bậc 0) để tránh ảnh hưởng của sai số số liệu gốc, sau đó cần định vị lại mạng lưới ở chu kỳ đang xét về vị trí trung bình của các điểm khống ché.én định. Quá trình định vị lại này được thực hiện thông qua việc áp dụng công thức chuyển đổi tọa độ:: X®) =X —B(CTB)'C75X (L4) trong đó: ðX là véc-tơ chuyển dịch của các điểm cơ sở trong chu kỷ khảo sát so với chu kỷ đầu (chu kỳ 0); Xf? là véc-tơ tọa độ bình sai lưới ở chu kỳ đang xét ứng với chế độ FIX 1 điểm gốc; X®) là véc-tơ tọa độ bình sai của lưới đó ứng với ma trận định vị C. Đối với lưới GNSS tự do ma trận B có dạng: 10 a-[ i= (1.5) Từ đó thu được biểu thức tính chuyển tọa độ bình sai giữa các phương án chon điều kiện định vị khác nhau như sau:</w:t>
+      </w:r>
+    </w:p>
+    <w:p>
+      <w:pPr>
+        <w:spacing w:after="100" w:before="0" w:line="360"/>
+        <w:ind w:firstLine="567"/>
+        <w:jc w:val="both"/>
+      </w:pPr>
+      <w:r>
+        <w:rPr>
+          <w:rFonts w:ascii="Times New Roman" w:cs="Times New Roman" w:eastAsia="Times New Roman" w:hAnsi="Times New Roman"/>
+          <w:b w:val="false"/>
+          <w:bCs w:val="false"/>
+          <w:i w:val="false"/>
+          <w:iCs w:val="false"/>
+          <w:sz w:val="26"/>
+          <w:szCs w:val="26"/>
+        </w:rPr>
+        <w:t xml:space="preserve">1- Tính chuyển tọa độ của các điểm trong lưới (gồm n điểm cơ sở) từ chế độ FIX 1 điểm gốc về lưới tự do với C = B: (8) 6 yp? = yj - [ey] n 2- Khi cần bớt đi 1 điểm định vị (ký hiệu là điểm £) trong tập hợp K điểm định vi: k YX prety xP) = x! a: có (7): ' YY mm. y?=y)- a Trong trường hợp việc định vị lưới được thực hiện dựa trên công thức (1.1), néu tla điểm không ổn định và cần phải loại bỏ khỏi quá trình định vị lưới (bằng cách gán cho điểm đó giá tri C = 0) thì tọa độ các điểm trong lưới sẽ được tính theo công thức: yl) = y(t) } 5x, K-1 by (1.8) (2) 5 Ve sili? 4 K-1 Xét đặc điểm của việc tính toán xử lý số liệu lưới GNSS và trên cơ sở các công thức chuyển đổi tọa độ trong mạng lưới như ở trên, thực hiện một quy trình phân tích độ ổn định lưới GNSS cơ sở trong quan trắc chuyển dịch ngang công trình theo phương pháp lặp nhích dần như sau: Bước 1: Trong chu kỳ đang khảo sát, thực hiện bình sai lưới khống chế cơ sở như mạng lưới tự do với 1 điểm FIX tọa độ. Bước 2: Tính chuyển tọa độ bình sai của các điểm trong mạng lưới về hệ tọa độ mới với điều kiện định vị C = B (công thức I.1). Bước 3: Tính độ lệch tọa độ của tất cảc các điểm trong lưới so với tọa độ các điểm đó ở chu kỳ đầu và áp dụng tiêu chuẩn (1.3) để kiểm tra, đánh giá độ ổn định của các điểm mốc có C = B trong lưới. Bước 4: Có thé xảy ra một trong hai kha năng:</w:t>
       </w:r>
     </w:p>
     <w:p>
@@ -14328,7 +14149,7 @@
           <w:sz w:val="26"/>
           <w:szCs w:val="26"/>
         </w:rPr>
-        <w:t xml:space="preserve">Bắt đầu | m h h h H 7 Binh sai lưới GNSS Tính chuyển tọa độ Tính độ lệch tọa độ FiX 1 diém gốc | (C =B) (ax, Gy, q) Chọn Ci=0 = (Điểm i không ổn định) Đúng Hình 1.1 - Sơ đồ phân tích độ ổn định mốc cơ sở quan trắc chuyển dịch ngang công trình bằng công nghệ GNSS tĩnh Vi DỤ: Xử lý số liệu lưới GNSS một cấp quan trắc chuyển dịch ngang công trình Quá trình xử lý số liệu quan trắc chuyển dịch ngang tường chắn X thuộc dự án A bằng công nghệ GNSS tĩnh theo sơ đồ lưới 1 cấp. Hình I.2 là sơ đồ lưới GNSS quan trắc chuyển dịch ngang tường chắn X. art ⁄ QT2 LZ xử Zz 2V ®Ằ QT4 tego</w:t>
+        <w:t xml:space="preserve">Bắt đầu Binh sai lưới GNSS Tính chuyển tọa độ Tính độ lệch tọa độ FiX 1 diém gốc | (C =B) (ax, Gy, q) Chọn Ci=0 = (Điểm i không ổn định) Đúng Hình 1.1 - Sơ đồ phân tích độ dn định mốc cơ sở quan trắc chuyển dịch ngang công trình bằng công nghệ GNSS tĩnh Vi DỤ: Xử lý số liệu lưới GNSS một cắp quan trắc chuyển dịch ngang công trình Quá trình xử lý số liệu quan trắc chuyển dịch ngang tường chắn X thuộc dự án A bằng công nghệ GNSS tĩnh theo sơ đồ lưới 1 cấp. Hình I.2 là sơ đồ lưới GNSS quan trắc chuyển dịch ngang tường chắn X. art ⁄ QT2 LZ xử Zz 2V ®Ằ QT4 tego</w:t>
       </w:r>
     </w:p>
     <w:p>
@@ -14442,7 +14263,7 @@
           <w:sz w:val="26"/>
           <w:szCs w:val="26"/>
         </w:rPr>
-        <w:t xml:space="preserve">— Mạng lưới quan trắc được thiết kế và đo đạc gồm một cấp lưới với yêu cầu là sai số trung phương</w:t>
+        <w:t xml:space="preserve">— Mạng lưới quan trắc được thiết kế và đo đạc gồm một cắp lưới với yêu cầu là sai số trung phương</w:t>
       </w:r>
     </w:p>
     <w:p>
@@ -14556,7 +14377,7 @@
           <w:sz w:val="26"/>
           <w:szCs w:val="26"/>
         </w:rPr>
-        <w:t xml:space="preserve">mốc (10/10/2017) (15/12/2047) (15/03/2018) Tiến hành phân tích độ ổn định của mốc chuẩn và tinh toán thông số chuyển dịch chu ky 1: Dựa vào tọa độ các mốc chuẩn MC1, MC2, MC3, MC4 ở chu kỳ 0 và chu kỳ 1 tiến hành phân tích độ ổn định của các móc chuẩn. Tiêu chuẩn ổn định của các mốc chuẩn lầy A =2xm,_ =2x3,5=7,0(mm). Kết quả tính toán và phân tích độ én định của các mốc chuẩn được thế hiện trong Bang I.2 và 1.3.</w:t>
+        <w:t xml:space="preserve">mốc (10/10/2017) (15/12/2047) (15/03/2018) Tiến hành phân tích độ ổn định của mốc chuẩn và tinh toán thông số chuyển dịch chu ky 1: Dựa vào tọa độ các mốc chuẩn MC1, MC2, MC3, MC4 ở chu kỳ 0 và chu kỳ 1 tiến hành phân tích độ dn định của các móc chuẩn. Tiêu chuẩn dn định của các mốc chuẩn lầy A =2xm,_ =2x3,5=7,0(mm). Kết quả tính toán và phân tích độ én định của các mốc chuẩn được thé hiện trong Bang I.2 và 1.3.</w:t>
       </w:r>
     </w:p>
     <w:p>
@@ -14593,7 +14414,7 @@
           <w:sz w:val="18"/>
           <w:szCs w:val="18"/>
         </w:rPr>
-        <w:t xml:space="preserve">[Bảng số liệu OCR chưa dựng đủ lưới kẻ — vui lòng đối chiếu PDF gốc trang tương ứng. Đoạn văn xung quanh vẫn giữ nguyên.]</w:t>
+        <w:t xml:space="preserve">[Bảng số liệu OCR chưa dựng đủ lưới kẻ — vui lòng đối chiếu PDF gốc. Đoạn văn xung quanh vẫn giữ nguyên.]</w:t>
       </w:r>
     </w:p>
     <w:p>
@@ -14684,7 +14505,7 @@
           <w:sz w:val="18"/>
           <w:szCs w:val="18"/>
         </w:rPr>
-        <w:t xml:space="preserve">[Bảng số liệu OCR chưa dựng đủ lưới kẻ — vui lòng đối chiếu PDF gốc trang tương ứng. Đoạn văn xung quanh vẫn giữ nguyên.]</w:t>
+        <w:t xml:space="preserve">[Bảng số liệu OCR chưa dựng đủ lưới kẻ — vui lòng đối chiếu PDF gốc. Đoạn văn xung quanh vẫn giữ nguyên.]</w:t>
       </w:r>
     </w:p>
     <w:p>
@@ -14721,7 +14542,7 @@
           <w:sz w:val="18"/>
           <w:szCs w:val="18"/>
         </w:rPr>
-        <w:t xml:space="preserve">[Bảng số liệu OCR chưa dựng đủ lưới kẻ — vui lòng đối chiếu PDF gốc trang tương ứng. Đoạn văn xung quanh vẫn giữ nguyên.]</w:t>
+        <w:t xml:space="preserve">[Bảng số liệu OCR chưa dựng đủ lưới kẻ — vui lòng đối chiếu PDF gốc. Đoạn văn xung quanh vẫn giữ nguyên.]</w:t>
       </w:r>
     </w:p>
     <w:p>
@@ -14776,7 +14597,7 @@
           <w:sz w:val="18"/>
           <w:szCs w:val="18"/>
         </w:rPr>
-        <w:t xml:space="preserve">[Bảng số liệu OCR chưa dựng đủ lưới kẻ — vui lòng đối chiếu PDF gốc trang tương ứng. Đoạn văn xung quanh vẫn giữ nguyên.]</w:t>
+        <w:t xml:space="preserve">[Bảng số liệu OCR chưa dựng đủ lưới kẻ — vui lòng đối chiếu PDF gốc. Đoạn văn xung quanh vẫn giữ nguyên.]</w:t>
       </w:r>
     </w:p>
     <w:p>
@@ -14831,7 +14652,7 @@
           <w:sz w:val="18"/>
           <w:szCs w:val="18"/>
         </w:rPr>
-        <w:t xml:space="preserve">[Bảng số liệu OCR chưa dựng đủ lưới kẻ — vui lòng đối chiếu PDF gốc trang tương ứng. Đoạn văn xung quanh vẫn giữ nguyên.]</w:t>
+        <w:t xml:space="preserve">[Bảng số liệu OCR chưa dựng đủ lưới kẻ — vui lòng đối chiếu PDF gốc. Đoạn văn xung quanh vẫn giữ nguyên.]</w:t>
       </w:r>
     </w:p>
     <w:p>
@@ -14868,6 +14689,24 @@
           <w:szCs w:val="20"/>
         </w:rPr>
         <w:t xml:space="preserve">(ni</w:t>
+      </w:r>
+    </w:p>
+    <w:p>
+      <w:pPr>
+        <w:spacing w:after="80" w:before="0" w:line="360"/>
+        <w:jc w:val="both"/>
+      </w:pPr>
+      <w:r>
+        <w:rPr>
+          <w:rFonts w:ascii="Times New Roman" w:cs="Times New Roman" w:eastAsia="Times New Roman" w:hAnsi="Times New Roman"/>
+          <w:b w:val="false"/>
+          <w:bCs w:val="false"/>
+          <w:i/>
+          <w:iCs/>
+          <w:sz w:val="20"/>
+          <w:szCs w:val="20"/>
+        </w:rPr>
+        <w:t xml:space="preserve">(mm) định | đánh</w:t>
       </w:r>
     </w:p>
     <w:p>
@@ -14922,7 +14761,7 @@
           <w:sz w:val="18"/>
           <w:szCs w:val="18"/>
         </w:rPr>
-        <w:t xml:space="preserve">[Bảng số liệu OCR chưa dựng đủ lưới kẻ — vui lòng đối chiếu PDF gốc trang tương ứng. Đoạn văn xung quanh vẫn giữ nguyên.]</w:t>
+        <w:t xml:space="preserve">[Bảng số liệu OCR chưa dựng đủ lưới kẻ — vui lòng đối chiếu PDF gốc. Đoạn văn xung quanh vẫn giữ nguyên.]</w:t>
       </w:r>
     </w:p>
     <w:p>

</xml_diff>